<commit_message>
BAYMAX : Documentation Updated !
</commit_message>
<xml_diff>
--- a/Documentation/DOCX Docs/BAYMAX - Report - Copy.docx
+++ b/Documentation/DOCX Docs/BAYMAX - Report - Copy.docx
@@ -764,6 +764,225 @@
       <w:pPr>
         <w:spacing w:line="360" w:lineRule="auto"/>
         <w:ind w:left="720"/>
+        <w:jc w:val="right"/>
+        <w:rPr>
+          <w:rFonts w:ascii="Arial" w:hAnsi="Arial" w:cs="Arial"/>
+          <w:b/>
+          <w:bCs/>
+        </w:rPr>
+      </w:pPr>
+      <w:r>
+        <w:rPr>
+          <w:rFonts w:ascii="Arial" w:hAnsi="Arial" w:cs="Arial"/>
+          <w:b/>
+          <w:bCs/>
+        </w:rPr>
+        <w:t>SIGNATURE OF THE CANDIDATE</w:t>
+      </w:r>
+    </w:p>
+    <w:p>
+      <w:pPr>
+        <w:spacing w:line="360" w:lineRule="auto"/>
+        <w:ind w:left="720"/>
+        <w:jc w:val="right"/>
+        <w:rPr>
+          <w:rFonts w:ascii="Arial" w:hAnsi="Arial" w:cs="Arial"/>
+          <w:b/>
+          <w:bCs/>
+        </w:rPr>
+      </w:pPr>
+    </w:p>
+    <w:p>
+      <w:pPr>
+        <w:spacing w:line="360" w:lineRule="auto"/>
+        <w:ind w:left="720"/>
+        <w:jc w:val="center"/>
+        <w:rPr>
+          <w:rFonts w:ascii="Arial" w:hAnsi="Arial" w:cs="Arial"/>
+          <w:b/>
+          <w:bCs/>
+        </w:rPr>
+      </w:pPr>
+      <w:r>
+        <w:rPr>
+          <w:rFonts w:ascii="Arial" w:hAnsi="Arial" w:cs="Arial"/>
+          <w:b/>
+          <w:bCs/>
+        </w:rPr>
+        <w:t>1.</w:t>
+      </w:r>
+    </w:p>
+    <w:p>
+      <w:pPr>
+        <w:spacing w:line="360" w:lineRule="auto"/>
+        <w:ind w:left="720"/>
+        <w:jc w:val="center"/>
+        <w:rPr>
+          <w:rFonts w:ascii="Arial" w:hAnsi="Arial" w:cs="Arial"/>
+          <w:b/>
+          <w:bCs/>
+        </w:rPr>
+      </w:pPr>
+      <w:r>
+        <w:rPr>
+          <w:rFonts w:ascii="Arial" w:hAnsi="Arial" w:cs="Arial"/>
+          <w:b/>
+          <w:bCs/>
+        </w:rPr>
+        <w:t>2.</w:t>
+      </w:r>
+    </w:p>
+    <w:p>
+      <w:pPr>
+        <w:spacing w:line="360" w:lineRule="auto"/>
+        <w:ind w:left="720"/>
+        <w:jc w:val="center"/>
+        <w:rPr>
+          <w:rFonts w:ascii="Arial" w:hAnsi="Arial" w:cs="Arial"/>
+          <w:b/>
+          <w:bCs/>
+        </w:rPr>
+      </w:pPr>
+      <w:r>
+        <w:rPr>
+          <w:rFonts w:ascii="Arial" w:hAnsi="Arial" w:cs="Arial"/>
+          <w:b/>
+          <w:bCs/>
+        </w:rPr>
+        <w:t>3.</w:t>
+      </w:r>
+    </w:p>
+    <w:p>
+      <w:pPr>
+        <w:spacing w:line="360" w:lineRule="auto"/>
+        <w:ind w:left="720"/>
+        <w:jc w:val="center"/>
+        <w:rPr>
+          <w:rFonts w:ascii="Arial" w:hAnsi="Arial" w:cs="Arial"/>
+          <w:b/>
+          <w:bCs/>
+        </w:rPr>
+      </w:pPr>
+      <w:r>
+        <w:rPr>
+          <w:rFonts w:ascii="Arial" w:hAnsi="Arial" w:cs="Arial"/>
+          <w:b/>
+          <w:bCs/>
+        </w:rPr>
+        <w:t>4.</w:t>
+      </w:r>
+    </w:p>
+    <w:p>
+      <w:pPr>
+        <w:spacing w:line="360" w:lineRule="auto"/>
+        <w:ind w:left="720"/>
+        <w:jc w:val="center"/>
+        <w:rPr>
+          <w:rFonts w:ascii="Arial" w:hAnsi="Arial" w:cs="Arial"/>
+          <w:b/>
+          <w:bCs/>
+        </w:rPr>
+      </w:pPr>
+      <w:r>
+        <w:rPr>
+          <w:rFonts w:ascii="Arial" w:hAnsi="Arial" w:cs="Arial"/>
+          <w:b/>
+          <w:bCs/>
+        </w:rPr>
+        <w:t>5.</w:t>
+      </w:r>
+    </w:p>
+    <w:p>
+      <w:pPr>
+        <w:spacing w:line="360" w:lineRule="auto"/>
+        <w:jc w:val="both"/>
+        <w:rPr>
+          <w:rFonts w:ascii="Arial" w:hAnsi="Arial" w:cs="Arial"/>
+          <w:b/>
+          <w:bCs/>
+        </w:rPr>
+      </w:pPr>
+    </w:p>
+    <w:p>
+      <w:pPr>
+        <w:spacing w:line="360" w:lineRule="auto"/>
+        <w:jc w:val="both"/>
+        <w:rPr>
+          <w:rFonts w:ascii="Arial" w:hAnsi="Arial" w:cs="Arial"/>
+          <w:b/>
+          <w:bCs/>
+        </w:rPr>
+      </w:pPr>
+    </w:p>
+    <w:p>
+      <w:pPr>
+        <w:spacing w:line="360" w:lineRule="auto"/>
+        <w:jc w:val="both"/>
+        <w:rPr>
+          <w:rFonts w:ascii="Arial" w:hAnsi="Arial" w:cs="Arial"/>
+          <w:b/>
+          <w:bCs/>
+        </w:rPr>
+      </w:pPr>
+    </w:p>
+    <w:p>
+      <w:pPr>
+        <w:spacing w:line="360" w:lineRule="auto"/>
+        <w:jc w:val="both"/>
+        <w:rPr>
+          <w:rFonts w:ascii="Arial" w:hAnsi="Arial" w:cs="Arial"/>
+          <w:b/>
+          <w:bCs/>
+        </w:rPr>
+      </w:pPr>
+    </w:p>
+    <w:p>
+      <w:pPr>
+        <w:spacing w:line="360" w:lineRule="auto"/>
+        <w:jc w:val="both"/>
+        <w:rPr>
+          <w:rFonts w:ascii="Arial" w:hAnsi="Arial" w:cs="Arial"/>
+          <w:b/>
+          <w:bCs/>
+        </w:rPr>
+      </w:pPr>
+    </w:p>
+    <w:p>
+      <w:pPr>
+        <w:spacing w:line="360" w:lineRule="auto"/>
+        <w:jc w:val="both"/>
+        <w:rPr>
+          <w:rFonts w:ascii="Arial" w:hAnsi="Arial" w:cs="Arial"/>
+          <w:b/>
+          <w:bCs/>
+        </w:rPr>
+      </w:pPr>
+    </w:p>
+    <w:p>
+      <w:pPr>
+        <w:spacing w:line="360" w:lineRule="auto"/>
+        <w:jc w:val="both"/>
+        <w:rPr>
+          <w:rFonts w:ascii="Arial" w:hAnsi="Arial" w:cs="Arial"/>
+          <w:b/>
+          <w:bCs/>
+        </w:rPr>
+      </w:pPr>
+    </w:p>
+    <w:p>
+      <w:pPr>
+        <w:spacing w:line="360" w:lineRule="auto"/>
+        <w:jc w:val="both"/>
+        <w:rPr>
+          <w:rFonts w:ascii="Arial" w:hAnsi="Arial" w:cs="Arial"/>
+          <w:b/>
+          <w:bCs/>
+        </w:rPr>
+      </w:pPr>
+    </w:p>
+    <w:p>
+      <w:pPr>
+        <w:spacing w:line="360" w:lineRule="auto"/>
         <w:jc w:val="both"/>
         <w:rPr>
           <w:rFonts w:ascii="Arial" w:hAnsi="Arial" w:cs="Arial"/>
@@ -850,14 +1069,6 @@
           <w:bCs/>
         </w:rPr>
         <w:t xml:space="preserve">                             </w:t>
-      </w:r>
-      <w:r>
-        <w:rPr>
-          <w:rFonts w:ascii="Arial" w:hAnsi="Arial" w:cs="Arial"/>
-          <w:b/>
-          <w:bCs/>
-        </w:rPr>
-        <w:t>SIGNATURE OF THE CANDIDATE</w:t>
       </w:r>
     </w:p>
     <w:p>
@@ -4793,19 +5004,6 @@
         <w:t>ist of Tables</w:t>
       </w:r>
     </w:p>
-    <w:p>
-      <w:pPr>
-        <w:spacing w:after="160" w:line="360" w:lineRule="auto"/>
-        <w:jc w:val="center"/>
-        <w:rPr>
-          <w:rFonts w:ascii="Arial" w:hAnsi="Arial" w:cs="Arial"/>
-          <w:b/>
-          <w:bCs/>
-          <w:sz w:val="28"/>
-          <w:szCs w:val="28"/>
-        </w:rPr>
-      </w:pPr>
-    </w:p>
     <w:tbl>
       <w:tblPr>
         <w:tblStyle w:val="TableGrid"/>
@@ -5128,15 +5326,6 @@
         <w:jc w:val="both"/>
         <w:rPr>
           <w:rFonts w:ascii="Arial" w:hAnsi="Arial" w:cs="Arial"/>
-        </w:rPr>
-      </w:pPr>
-    </w:p>
-    <w:p>
-      <w:pPr>
-        <w:spacing w:after="160" w:line="360" w:lineRule="auto"/>
-        <w:jc w:val="both"/>
-        <w:rPr>
-          <w:rFonts w:ascii="Arial" w:hAnsi="Arial" w:cs="Arial"/>
           <w:b/>
           <w:bCs/>
         </w:rPr>
@@ -5287,11 +5476,14 @@
         <w:spacing w:after="160" w:line="360" w:lineRule="auto"/>
         <w:jc w:val="center"/>
         <w:rPr>
-          <w:rFonts w:ascii="Arial" w:hAnsi="Arial" w:cs="Arial"/>
-          <w:b/>
-          <w:bCs/>
+          <w:rStyle w:val="Hyperlink"/>
+          <w:rFonts w:ascii="Arial" w:hAnsi="Arial" w:cs="Arial"/>
+          <w:b/>
+          <w:bCs/>
+          <w:color w:val="auto"/>
           <w:sz w:val="28"/>
           <w:szCs w:val="28"/>
+          <w:u w:val="none"/>
         </w:rPr>
       </w:pPr>
       <w:r>
@@ -5305,18 +5497,6 @@
         <w:lastRenderedPageBreak/>
         <w:t>List of Figures</w:t>
       </w:r>
-    </w:p>
-    <w:p>
-      <w:pPr>
-        <w:spacing w:after="160" w:line="360" w:lineRule="auto"/>
-        <w:jc w:val="center"/>
-        <w:rPr>
-          <w:rStyle w:val="Hyperlink"/>
-          <w:rFonts w:ascii="Arial" w:hAnsi="Arial" w:cs="Arial"/>
-          <w:color w:val="auto"/>
-          <w:u w:val="none"/>
-        </w:rPr>
-      </w:pPr>
       <w:r>
         <w:rPr>
           <w:rFonts w:ascii="Arial" w:hAnsi="Arial" w:cs="Arial"/>
@@ -5620,7 +5800,727 @@
           </w:p>
         </w:tc>
       </w:tr>
+      <w:tr>
+        <w:tc>
+          <w:tcPr>
+            <w:tcW w:w="1271" w:type="dxa"/>
+          </w:tcPr>
+          <w:p>
+            <w:pPr>
+              <w:pStyle w:val="TableofFigures"/>
+              <w:spacing w:line="360" w:lineRule="auto"/>
+            </w:pPr>
+            <w:r>
+              <w:t>Figure 4</w:t>
+            </w:r>
+          </w:p>
+        </w:tc>
+        <w:tc>
+          <w:tcPr>
+            <w:tcW w:w="6946" w:type="dxa"/>
+          </w:tcPr>
+          <w:p>
+            <w:pPr>
+              <w:pStyle w:val="TableofFigures"/>
+              <w:spacing w:line="360" w:lineRule="auto"/>
+              <w:rPr>
+                <w:rFonts w:eastAsiaTheme="minorEastAsia" w:cs="Arial"/>
+                <w:noProof/>
+                <w:kern w:val="2"/>
+                <w:szCs w:val="24"/>
+                <w:lang w:val="en-IN" w:eastAsia="en-IN" w:bidi="ar-SA"/>
+                <w14:ligatures w14:val="standardContextual"/>
+              </w:rPr>
+            </w:pPr>
+            <w:r>
+              <w:rPr>
+                <w:rFonts w:eastAsiaTheme="minorEastAsia" w:cs="Arial"/>
+                <w:noProof/>
+                <w:kern w:val="2"/>
+                <w:szCs w:val="24"/>
+                <w:lang w:val="en-IN" w:eastAsia="en-IN" w:bidi="ar-SA"/>
+                <w14:ligatures w14:val="standardContextual"/>
+              </w:rPr>
+              <w:t>Home Page</w:t>
+            </w:r>
+          </w:p>
+        </w:tc>
+        <w:tc>
+          <w:tcPr>
+            <w:tcW w:w="560" w:type="dxa"/>
+          </w:tcPr>
+          <w:p>
+            <w:pPr>
+              <w:pStyle w:val="TableofFigures"/>
+              <w:spacing w:line="360" w:lineRule="auto"/>
+              <w:rPr>
+                <w:rFonts w:eastAsiaTheme="minorEastAsia" w:cs="Arial"/>
+                <w:noProof/>
+                <w:kern w:val="2"/>
+                <w:szCs w:val="24"/>
+                <w:lang w:val="en-IN" w:eastAsia="en-IN" w:bidi="ar-SA"/>
+                <w14:ligatures w14:val="standardContextual"/>
+              </w:rPr>
+            </w:pPr>
+            <w:r>
+              <w:rPr>
+                <w:rFonts w:eastAsiaTheme="minorEastAsia" w:cs="Arial"/>
+                <w:noProof/>
+                <w:kern w:val="2"/>
+                <w:szCs w:val="24"/>
+                <w:lang w:val="en-IN" w:eastAsia="en-IN" w:bidi="ar-SA"/>
+                <w14:ligatures w14:val="standardContextual"/>
+              </w:rPr>
+              <w:t>28</w:t>
+            </w:r>
+          </w:p>
+        </w:tc>
+      </w:tr>
+      <w:tr>
+        <w:tc>
+          <w:tcPr>
+            <w:tcW w:w="1271" w:type="dxa"/>
+          </w:tcPr>
+          <w:p>
+            <w:pPr>
+              <w:pStyle w:val="TableofFigures"/>
+              <w:spacing w:line="360" w:lineRule="auto"/>
+            </w:pPr>
+            <w:r>
+              <w:t>Figure 5</w:t>
+            </w:r>
+          </w:p>
+        </w:tc>
+        <w:tc>
+          <w:tcPr>
+            <w:tcW w:w="6946" w:type="dxa"/>
+          </w:tcPr>
+          <w:p>
+            <w:pPr>
+              <w:pStyle w:val="TableofFigures"/>
+              <w:spacing w:line="360" w:lineRule="auto"/>
+              <w:rPr>
+                <w:rFonts w:eastAsiaTheme="minorEastAsia" w:cs="Arial"/>
+                <w:noProof/>
+                <w:kern w:val="2"/>
+                <w:szCs w:val="24"/>
+                <w:lang w:val="en-IN" w:eastAsia="en-IN" w:bidi="ar-SA"/>
+                <w14:ligatures w14:val="standardContextual"/>
+              </w:rPr>
+            </w:pPr>
+            <w:r>
+              <w:rPr>
+                <w:rFonts w:eastAsiaTheme="minorEastAsia" w:cs="Arial"/>
+                <w:noProof/>
+                <w:kern w:val="2"/>
+                <w:szCs w:val="24"/>
+                <w:lang w:val="en-IN" w:eastAsia="en-IN" w:bidi="ar-SA"/>
+                <w14:ligatures w14:val="standardContextual"/>
+              </w:rPr>
+              <w:t>User Registration Page</w:t>
+            </w:r>
+          </w:p>
+        </w:tc>
+        <w:tc>
+          <w:tcPr>
+            <w:tcW w:w="560" w:type="dxa"/>
+          </w:tcPr>
+          <w:p>
+            <w:pPr>
+              <w:pStyle w:val="TableofFigures"/>
+              <w:spacing w:line="360" w:lineRule="auto"/>
+              <w:rPr>
+                <w:rFonts w:eastAsiaTheme="minorEastAsia" w:cs="Arial"/>
+                <w:noProof/>
+                <w:kern w:val="2"/>
+                <w:szCs w:val="24"/>
+                <w:lang w:val="en-IN" w:eastAsia="en-IN" w:bidi="ar-SA"/>
+                <w14:ligatures w14:val="standardContextual"/>
+              </w:rPr>
+            </w:pPr>
+            <w:r>
+              <w:rPr>
+                <w:rFonts w:eastAsiaTheme="minorEastAsia" w:cs="Arial"/>
+                <w:noProof/>
+                <w:kern w:val="2"/>
+                <w:szCs w:val="24"/>
+                <w:lang w:val="en-IN" w:eastAsia="en-IN" w:bidi="ar-SA"/>
+                <w14:ligatures w14:val="standardContextual"/>
+              </w:rPr>
+              <w:t>29</w:t>
+            </w:r>
+          </w:p>
+        </w:tc>
+      </w:tr>
+      <w:tr>
+        <w:tc>
+          <w:tcPr>
+            <w:tcW w:w="1271" w:type="dxa"/>
+          </w:tcPr>
+          <w:p>
+            <w:pPr>
+              <w:pStyle w:val="TableofFigures"/>
+              <w:spacing w:line="360" w:lineRule="auto"/>
+            </w:pPr>
+            <w:r>
+              <w:t>Figure 6</w:t>
+            </w:r>
+          </w:p>
+        </w:tc>
+        <w:tc>
+          <w:tcPr>
+            <w:tcW w:w="6946" w:type="dxa"/>
+          </w:tcPr>
+          <w:p>
+            <w:pPr>
+              <w:pStyle w:val="TableofFigures"/>
+              <w:spacing w:line="360" w:lineRule="auto"/>
+              <w:rPr>
+                <w:rFonts w:eastAsiaTheme="minorEastAsia" w:cs="Arial"/>
+                <w:noProof/>
+                <w:kern w:val="2"/>
+                <w:szCs w:val="24"/>
+                <w:lang w:val="en-IN" w:eastAsia="en-IN" w:bidi="ar-SA"/>
+                <w14:ligatures w14:val="standardContextual"/>
+              </w:rPr>
+            </w:pPr>
+            <w:r>
+              <w:rPr>
+                <w:rFonts w:eastAsiaTheme="minorEastAsia" w:cs="Arial"/>
+                <w:noProof/>
+                <w:kern w:val="2"/>
+                <w:szCs w:val="24"/>
+                <w:lang w:val="en-IN" w:eastAsia="en-IN" w:bidi="ar-SA"/>
+                <w14:ligatures w14:val="standardContextual"/>
+              </w:rPr>
+              <w:t>Login Page</w:t>
+            </w:r>
+          </w:p>
+        </w:tc>
+        <w:tc>
+          <w:tcPr>
+            <w:tcW w:w="560" w:type="dxa"/>
+          </w:tcPr>
+          <w:p>
+            <w:pPr>
+              <w:pStyle w:val="TableofFigures"/>
+              <w:spacing w:line="360" w:lineRule="auto"/>
+              <w:rPr>
+                <w:rFonts w:eastAsiaTheme="minorEastAsia" w:cs="Arial"/>
+                <w:noProof/>
+                <w:kern w:val="2"/>
+                <w:szCs w:val="24"/>
+                <w:lang w:val="en-IN" w:eastAsia="en-IN" w:bidi="ar-SA"/>
+                <w14:ligatures w14:val="standardContextual"/>
+              </w:rPr>
+            </w:pPr>
+            <w:r>
+              <w:rPr>
+                <w:rFonts w:eastAsiaTheme="minorEastAsia" w:cs="Arial"/>
+                <w:noProof/>
+                <w:kern w:val="2"/>
+                <w:szCs w:val="24"/>
+                <w:lang w:val="en-IN" w:eastAsia="en-IN" w:bidi="ar-SA"/>
+                <w14:ligatures w14:val="standardContextual"/>
+              </w:rPr>
+              <w:t>29</w:t>
+            </w:r>
+          </w:p>
+        </w:tc>
+      </w:tr>
+      <w:tr>
+        <w:tc>
+          <w:tcPr>
+            <w:tcW w:w="1271" w:type="dxa"/>
+          </w:tcPr>
+          <w:p>
+            <w:pPr>
+              <w:pStyle w:val="TableofFigures"/>
+              <w:spacing w:line="360" w:lineRule="auto"/>
+            </w:pPr>
+            <w:r>
+              <w:t>Figure 7</w:t>
+            </w:r>
+          </w:p>
+        </w:tc>
+        <w:tc>
+          <w:tcPr>
+            <w:tcW w:w="6946" w:type="dxa"/>
+          </w:tcPr>
+          <w:p>
+            <w:pPr>
+              <w:pStyle w:val="TableofFigures"/>
+              <w:spacing w:line="360" w:lineRule="auto"/>
+              <w:rPr>
+                <w:rFonts w:eastAsiaTheme="minorEastAsia" w:cs="Arial"/>
+                <w:noProof/>
+                <w:kern w:val="2"/>
+                <w:szCs w:val="24"/>
+                <w:lang w:val="en-IN" w:eastAsia="en-IN" w:bidi="ar-SA"/>
+                <w14:ligatures w14:val="standardContextual"/>
+              </w:rPr>
+            </w:pPr>
+            <w:r>
+              <w:rPr>
+                <w:rFonts w:eastAsiaTheme="minorEastAsia" w:cs="Arial"/>
+                <w:noProof/>
+                <w:kern w:val="2"/>
+                <w:szCs w:val="24"/>
+                <w:lang w:val="en-IN" w:eastAsia="en-IN" w:bidi="ar-SA"/>
+                <w14:ligatures w14:val="standardContextual"/>
+              </w:rPr>
+              <w:t>Patient Dashboard</w:t>
+            </w:r>
+          </w:p>
+        </w:tc>
+        <w:tc>
+          <w:tcPr>
+            <w:tcW w:w="560" w:type="dxa"/>
+          </w:tcPr>
+          <w:p>
+            <w:pPr>
+              <w:pStyle w:val="TableofFigures"/>
+              <w:spacing w:line="360" w:lineRule="auto"/>
+              <w:rPr>
+                <w:rFonts w:eastAsiaTheme="minorEastAsia" w:cs="Arial"/>
+                <w:noProof/>
+                <w:kern w:val="2"/>
+                <w:szCs w:val="24"/>
+                <w:lang w:val="en-IN" w:eastAsia="en-IN" w:bidi="ar-SA"/>
+                <w14:ligatures w14:val="standardContextual"/>
+              </w:rPr>
+            </w:pPr>
+            <w:r>
+              <w:rPr>
+                <w:rFonts w:eastAsiaTheme="minorEastAsia" w:cs="Arial"/>
+                <w:noProof/>
+                <w:kern w:val="2"/>
+                <w:szCs w:val="24"/>
+                <w:lang w:val="en-IN" w:eastAsia="en-IN" w:bidi="ar-SA"/>
+                <w14:ligatures w14:val="standardContextual"/>
+              </w:rPr>
+              <w:t>30</w:t>
+            </w:r>
+          </w:p>
+        </w:tc>
+      </w:tr>
+      <w:tr>
+        <w:tc>
+          <w:tcPr>
+            <w:tcW w:w="1271" w:type="dxa"/>
+          </w:tcPr>
+          <w:p>
+            <w:pPr>
+              <w:pStyle w:val="TableofFigures"/>
+              <w:spacing w:line="360" w:lineRule="auto"/>
+            </w:pPr>
+            <w:r>
+              <w:t>Figure 8</w:t>
+            </w:r>
+          </w:p>
+        </w:tc>
+        <w:tc>
+          <w:tcPr>
+            <w:tcW w:w="6946" w:type="dxa"/>
+          </w:tcPr>
+          <w:p>
+            <w:pPr>
+              <w:pStyle w:val="TableofFigures"/>
+              <w:spacing w:line="360" w:lineRule="auto"/>
+              <w:rPr>
+                <w:rFonts w:eastAsiaTheme="minorEastAsia" w:cs="Arial"/>
+                <w:noProof/>
+                <w:kern w:val="2"/>
+                <w:szCs w:val="24"/>
+                <w:lang w:val="en-IN" w:eastAsia="en-IN" w:bidi="ar-SA"/>
+                <w14:ligatures w14:val="standardContextual"/>
+              </w:rPr>
+            </w:pPr>
+            <w:r>
+              <w:rPr>
+                <w:rFonts w:eastAsiaTheme="minorEastAsia" w:cs="Arial"/>
+                <w:noProof/>
+                <w:kern w:val="2"/>
+                <w:szCs w:val="24"/>
+                <w:lang w:val="en-IN" w:eastAsia="en-IN" w:bidi="ar-SA"/>
+                <w14:ligatures w14:val="standardContextual"/>
+              </w:rPr>
+              <w:t>Doctor Appointment Page</w:t>
+            </w:r>
+          </w:p>
+        </w:tc>
+        <w:tc>
+          <w:tcPr>
+            <w:tcW w:w="560" w:type="dxa"/>
+          </w:tcPr>
+          <w:p>
+            <w:pPr>
+              <w:pStyle w:val="TableofFigures"/>
+              <w:spacing w:line="360" w:lineRule="auto"/>
+              <w:rPr>
+                <w:rFonts w:eastAsiaTheme="minorEastAsia" w:cs="Arial"/>
+                <w:noProof/>
+                <w:kern w:val="2"/>
+                <w:szCs w:val="24"/>
+                <w:lang w:val="en-IN" w:eastAsia="en-IN" w:bidi="ar-SA"/>
+                <w14:ligatures w14:val="standardContextual"/>
+              </w:rPr>
+            </w:pPr>
+            <w:r>
+              <w:rPr>
+                <w:rFonts w:eastAsiaTheme="minorEastAsia" w:cs="Arial"/>
+                <w:noProof/>
+                <w:kern w:val="2"/>
+                <w:szCs w:val="24"/>
+                <w:lang w:val="en-IN" w:eastAsia="en-IN" w:bidi="ar-SA"/>
+                <w14:ligatures w14:val="standardContextual"/>
+              </w:rPr>
+              <w:t>30</w:t>
+            </w:r>
+          </w:p>
+        </w:tc>
+      </w:tr>
+      <w:tr>
+        <w:tc>
+          <w:tcPr>
+            <w:tcW w:w="1271" w:type="dxa"/>
+          </w:tcPr>
+          <w:p>
+            <w:pPr>
+              <w:pStyle w:val="TableofFigures"/>
+              <w:spacing w:line="360" w:lineRule="auto"/>
+            </w:pPr>
+            <w:r>
+              <w:t>Figure 9</w:t>
+            </w:r>
+          </w:p>
+        </w:tc>
+        <w:tc>
+          <w:tcPr>
+            <w:tcW w:w="6946" w:type="dxa"/>
+          </w:tcPr>
+          <w:p>
+            <w:pPr>
+              <w:pStyle w:val="TableofFigures"/>
+              <w:spacing w:line="360" w:lineRule="auto"/>
+              <w:rPr>
+                <w:rFonts w:eastAsiaTheme="minorEastAsia" w:cs="Arial"/>
+                <w:noProof/>
+                <w:kern w:val="2"/>
+                <w:szCs w:val="24"/>
+                <w:lang w:val="en-IN" w:eastAsia="en-IN" w:bidi="ar-SA"/>
+                <w14:ligatures w14:val="standardContextual"/>
+              </w:rPr>
+            </w:pPr>
+            <w:r>
+              <w:rPr>
+                <w:rFonts w:eastAsiaTheme="minorEastAsia" w:cs="Arial"/>
+                <w:noProof/>
+                <w:kern w:val="2"/>
+                <w:szCs w:val="24"/>
+                <w:lang w:val="en-IN" w:eastAsia="en-IN" w:bidi="ar-SA"/>
+                <w14:ligatures w14:val="standardContextual"/>
+              </w:rPr>
+              <w:t>Buy Medicines Page</w:t>
+            </w:r>
+          </w:p>
+        </w:tc>
+        <w:tc>
+          <w:tcPr>
+            <w:tcW w:w="560" w:type="dxa"/>
+          </w:tcPr>
+          <w:p>
+            <w:pPr>
+              <w:pStyle w:val="TableofFigures"/>
+              <w:spacing w:line="360" w:lineRule="auto"/>
+              <w:rPr>
+                <w:rFonts w:eastAsiaTheme="minorEastAsia" w:cs="Arial"/>
+                <w:noProof/>
+                <w:kern w:val="2"/>
+                <w:szCs w:val="24"/>
+                <w:lang w:val="en-IN" w:eastAsia="en-IN" w:bidi="ar-SA"/>
+                <w14:ligatures w14:val="standardContextual"/>
+              </w:rPr>
+            </w:pPr>
+            <w:r>
+              <w:rPr>
+                <w:rFonts w:eastAsiaTheme="minorEastAsia" w:cs="Arial"/>
+                <w:noProof/>
+                <w:kern w:val="2"/>
+                <w:szCs w:val="24"/>
+                <w:lang w:val="en-IN" w:eastAsia="en-IN" w:bidi="ar-SA"/>
+                <w14:ligatures w14:val="standardContextual"/>
+              </w:rPr>
+              <w:t>31</w:t>
+            </w:r>
+          </w:p>
+        </w:tc>
+      </w:tr>
+      <w:tr>
+        <w:tc>
+          <w:tcPr>
+            <w:tcW w:w="1271" w:type="dxa"/>
+          </w:tcPr>
+          <w:p>
+            <w:pPr>
+              <w:pStyle w:val="TableofFigures"/>
+              <w:spacing w:line="360" w:lineRule="auto"/>
+            </w:pPr>
+            <w:r>
+              <w:t>Figure 10</w:t>
+            </w:r>
+          </w:p>
+        </w:tc>
+        <w:tc>
+          <w:tcPr>
+            <w:tcW w:w="6946" w:type="dxa"/>
+          </w:tcPr>
+          <w:p>
+            <w:pPr>
+              <w:pStyle w:val="TableofFigures"/>
+              <w:spacing w:line="360" w:lineRule="auto"/>
+              <w:rPr>
+                <w:rFonts w:eastAsiaTheme="minorEastAsia" w:cs="Arial"/>
+                <w:noProof/>
+                <w:kern w:val="2"/>
+                <w:szCs w:val="24"/>
+                <w:lang w:val="en-IN" w:eastAsia="en-IN" w:bidi="ar-SA"/>
+                <w14:ligatures w14:val="standardContextual"/>
+              </w:rPr>
+            </w:pPr>
+            <w:r>
+              <w:rPr>
+                <w:rFonts w:eastAsiaTheme="minorEastAsia" w:cs="Arial"/>
+                <w:noProof/>
+                <w:kern w:val="2"/>
+                <w:szCs w:val="24"/>
+                <w:lang w:val="en-IN" w:eastAsia="en-IN" w:bidi="ar-SA"/>
+                <w14:ligatures w14:val="standardContextual"/>
+              </w:rPr>
+              <w:t>Health Records Page</w:t>
+            </w:r>
+          </w:p>
+        </w:tc>
+        <w:tc>
+          <w:tcPr>
+            <w:tcW w:w="560" w:type="dxa"/>
+          </w:tcPr>
+          <w:p>
+            <w:pPr>
+              <w:pStyle w:val="TableofFigures"/>
+              <w:spacing w:line="360" w:lineRule="auto"/>
+              <w:rPr>
+                <w:rFonts w:eastAsiaTheme="minorEastAsia" w:cs="Arial"/>
+                <w:noProof/>
+                <w:kern w:val="2"/>
+                <w:szCs w:val="24"/>
+                <w:lang w:val="en-IN" w:eastAsia="en-IN" w:bidi="ar-SA"/>
+                <w14:ligatures w14:val="standardContextual"/>
+              </w:rPr>
+            </w:pPr>
+            <w:r>
+              <w:rPr>
+                <w:rFonts w:eastAsiaTheme="minorEastAsia" w:cs="Arial"/>
+                <w:noProof/>
+                <w:kern w:val="2"/>
+                <w:szCs w:val="24"/>
+                <w:lang w:val="en-IN" w:eastAsia="en-IN" w:bidi="ar-SA"/>
+                <w14:ligatures w14:val="standardContextual"/>
+              </w:rPr>
+              <w:t>31</w:t>
+            </w:r>
+          </w:p>
+        </w:tc>
+      </w:tr>
+      <w:tr>
+        <w:tc>
+          <w:tcPr>
+            <w:tcW w:w="1271" w:type="dxa"/>
+          </w:tcPr>
+          <w:p>
+            <w:pPr>
+              <w:pStyle w:val="TableofFigures"/>
+              <w:spacing w:line="360" w:lineRule="auto"/>
+            </w:pPr>
+            <w:r>
+              <w:t>Figure 11</w:t>
+            </w:r>
+          </w:p>
+        </w:tc>
+        <w:tc>
+          <w:tcPr>
+            <w:tcW w:w="6946" w:type="dxa"/>
+          </w:tcPr>
+          <w:p>
+            <w:pPr>
+              <w:pStyle w:val="TableofFigures"/>
+              <w:spacing w:line="360" w:lineRule="auto"/>
+              <w:rPr>
+                <w:rFonts w:eastAsiaTheme="minorEastAsia" w:cs="Arial"/>
+                <w:noProof/>
+                <w:kern w:val="2"/>
+                <w:szCs w:val="24"/>
+                <w:lang w:val="en-IN" w:eastAsia="en-IN" w:bidi="ar-SA"/>
+                <w14:ligatures w14:val="standardContextual"/>
+              </w:rPr>
+            </w:pPr>
+            <w:r>
+              <w:rPr>
+                <w:rFonts w:eastAsiaTheme="minorEastAsia" w:cs="Arial"/>
+                <w:noProof/>
+                <w:kern w:val="2"/>
+                <w:szCs w:val="24"/>
+                <w:lang w:val="en-IN" w:eastAsia="en-IN" w:bidi="ar-SA"/>
+                <w14:ligatures w14:val="standardContextual"/>
+              </w:rPr>
+              <w:t>AI Health Assistant Interface</w:t>
+            </w:r>
+          </w:p>
+        </w:tc>
+        <w:tc>
+          <w:tcPr>
+            <w:tcW w:w="560" w:type="dxa"/>
+          </w:tcPr>
+          <w:p>
+            <w:pPr>
+              <w:pStyle w:val="TableofFigures"/>
+              <w:spacing w:line="360" w:lineRule="auto"/>
+              <w:rPr>
+                <w:rFonts w:eastAsiaTheme="minorEastAsia" w:cs="Arial"/>
+                <w:noProof/>
+                <w:kern w:val="2"/>
+                <w:szCs w:val="24"/>
+                <w:lang w:val="en-IN" w:eastAsia="en-IN" w:bidi="ar-SA"/>
+                <w14:ligatures w14:val="standardContextual"/>
+              </w:rPr>
+            </w:pPr>
+            <w:r>
+              <w:rPr>
+                <w:rFonts w:eastAsiaTheme="minorEastAsia" w:cs="Arial"/>
+                <w:noProof/>
+                <w:kern w:val="2"/>
+                <w:szCs w:val="24"/>
+                <w:lang w:val="en-IN" w:eastAsia="en-IN" w:bidi="ar-SA"/>
+                <w14:ligatures w14:val="standardContextual"/>
+              </w:rPr>
+              <w:t>32</w:t>
+            </w:r>
+          </w:p>
+        </w:tc>
+      </w:tr>
+      <w:tr>
+        <w:tc>
+          <w:tcPr>
+            <w:tcW w:w="1271" w:type="dxa"/>
+          </w:tcPr>
+          <w:p>
+            <w:pPr>
+              <w:pStyle w:val="TableofFigures"/>
+              <w:spacing w:line="360" w:lineRule="auto"/>
+            </w:pPr>
+            <w:r>
+              <w:t>Figure 12</w:t>
+            </w:r>
+          </w:p>
+        </w:tc>
+        <w:tc>
+          <w:tcPr>
+            <w:tcW w:w="6946" w:type="dxa"/>
+          </w:tcPr>
+          <w:p>
+            <w:pPr>
+              <w:pStyle w:val="TableofFigures"/>
+              <w:spacing w:line="360" w:lineRule="auto"/>
+              <w:rPr>
+                <w:rFonts w:eastAsiaTheme="minorEastAsia" w:cs="Arial"/>
+                <w:noProof/>
+                <w:kern w:val="2"/>
+                <w:szCs w:val="24"/>
+                <w:lang w:val="en-IN" w:eastAsia="en-IN" w:bidi="ar-SA"/>
+                <w14:ligatures w14:val="standardContextual"/>
+              </w:rPr>
+            </w:pPr>
+            <w:r>
+              <w:rPr>
+                <w:rFonts w:eastAsiaTheme="minorEastAsia" w:cs="Arial"/>
+                <w:noProof/>
+                <w:kern w:val="2"/>
+                <w:szCs w:val="24"/>
+                <w:lang w:val="en-IN" w:eastAsia="en-IN" w:bidi="ar-SA"/>
+                <w14:ligatures w14:val="standardContextual"/>
+              </w:rPr>
+              <w:t>Emergency Assistance Page</w:t>
+            </w:r>
+          </w:p>
+        </w:tc>
+        <w:tc>
+          <w:tcPr>
+            <w:tcW w:w="560" w:type="dxa"/>
+          </w:tcPr>
+          <w:p>
+            <w:pPr>
+              <w:pStyle w:val="TableofFigures"/>
+              <w:spacing w:line="360" w:lineRule="auto"/>
+              <w:rPr>
+                <w:rFonts w:eastAsiaTheme="minorEastAsia" w:cs="Arial"/>
+                <w:noProof/>
+                <w:kern w:val="2"/>
+                <w:szCs w:val="24"/>
+                <w:lang w:val="en-IN" w:eastAsia="en-IN" w:bidi="ar-SA"/>
+                <w14:ligatures w14:val="standardContextual"/>
+              </w:rPr>
+            </w:pPr>
+            <w:r>
+              <w:rPr>
+                <w:rFonts w:eastAsiaTheme="minorEastAsia" w:cs="Arial"/>
+                <w:noProof/>
+                <w:kern w:val="2"/>
+                <w:szCs w:val="24"/>
+                <w:lang w:val="en-IN" w:eastAsia="en-IN" w:bidi="ar-SA"/>
+                <w14:ligatures w14:val="standardContextual"/>
+              </w:rPr>
+              <w:t>32</w:t>
+            </w:r>
+          </w:p>
+        </w:tc>
+      </w:tr>
     </w:tbl>
+    <w:p>
+      <w:pPr>
+        <w:pStyle w:val="TableofFigures"/>
+        <w:tabs>
+          <w:tab w:val="right" w:leader="dot" w:pos="8777"/>
+        </w:tabs>
+        <w:rPr>
+          <w:rFonts w:asciiTheme="minorHAnsi" w:eastAsiaTheme="minorEastAsia" w:hAnsiTheme="minorHAnsi" w:cstheme="minorBidi"/>
+          <w:noProof/>
+          <w:kern w:val="2"/>
+          <w:szCs w:val="24"/>
+          <w:lang w:val="en-IN" w:eastAsia="en-IN" w:bidi="ar-SA"/>
+          <w14:ligatures w14:val="standardContextual"/>
+        </w:rPr>
+      </w:pPr>
+      <w:r>
+        <w:rPr>
+          <w:rFonts w:cs="Arial"/>
+        </w:rPr>
+        <w:fldChar w:fldCharType="end"/>
+      </w:r>
+    </w:p>
+    <w:p>
+      <w:pPr>
+        <w:spacing w:after="160" w:line="278" w:lineRule="auto"/>
+        <w:rPr>
+          <w:rFonts w:ascii="Arial" w:hAnsi="Arial" w:cs="Arial"/>
+        </w:rPr>
+      </w:pPr>
+      <w:r>
+        <w:rPr>
+          <w:rFonts w:ascii="Arial" w:hAnsi="Arial" w:cs="Arial"/>
+        </w:rPr>
+        <w:br w:type="page"/>
+      </w:r>
+    </w:p>
     <w:p>
       <w:pPr>
         <w:spacing w:after="160" w:line="360" w:lineRule="auto"/>
@@ -5632,150 +6532,767 @@
       <w:r>
         <w:rPr>
           <w:rFonts w:ascii="Arial" w:hAnsi="Arial" w:cs="Arial"/>
-        </w:rPr>
-        <w:fldChar w:fldCharType="end"/>
-      </w:r>
-    </w:p>
-    <w:p>
-      <w:pPr>
-        <w:spacing w:after="160" w:line="278" w:lineRule="auto"/>
-        <w:rPr>
-          <w:rFonts w:ascii="Arial" w:hAnsi="Arial" w:cs="Arial"/>
-        </w:rPr>
-      </w:pPr>
-      <w:r>
-        <w:rPr>
-          <w:rFonts w:ascii="Arial" w:hAnsi="Arial" w:cs="Arial"/>
-        </w:rPr>
-        <w:br w:type="page"/>
-      </w:r>
-    </w:p>
-    <w:p>
-      <w:pPr>
-        <w:spacing w:after="160" w:line="360" w:lineRule="auto"/>
-        <w:jc w:val="center"/>
-        <w:rPr>
-          <w:rFonts w:ascii="Arial" w:hAnsi="Arial" w:cs="Arial"/>
-        </w:rPr>
-      </w:pPr>
-    </w:p>
-    <w:p>
-      <w:pPr>
-        <w:pStyle w:val="HHHHHH"/>
-      </w:pPr>
-      <w:r>
-        <w:t>ABSTRACT</w:t>
-      </w:r>
-    </w:p>
-    <w:p>
-      <w:pPr>
-        <w:spacing w:line="360" w:lineRule="auto"/>
-        <w:jc w:val="both"/>
-        <w:rPr>
-          <w:rFonts w:ascii="Arial" w:hAnsi="Arial" w:cs="Arial"/>
-        </w:rPr>
-      </w:pPr>
-    </w:p>
-    <w:p>
-      <w:pPr>
-        <w:spacing w:line="360" w:lineRule="auto"/>
-        <w:jc w:val="both"/>
-        <w:rPr>
-          <w:rFonts w:ascii="Arial" w:hAnsi="Arial" w:cs="Arial"/>
-        </w:rPr>
-      </w:pPr>
-      <w:r>
-        <w:rPr>
-          <w:rFonts w:ascii="Arial" w:hAnsi="Arial" w:cs="Arial"/>
-        </w:rPr>
-        <w:t xml:space="preserve">Accessing timely healthcare services is often challenging due to lack of medical awareness, difficulty in finding suitable doctors, long waiting times, and scattered healthcare resources. BAYMAX is an intelligent, user-centric system designed to simplify healthcare access by integrating doctor recommendation, appointment booking, pharmacy assistance, navigation, health guidance, and emergency support into a single </w:t>
-      </w:r>
-      <w:r>
-        <w:rPr>
-          <w:rFonts w:ascii="Arial" w:hAnsi="Arial" w:cs="Arial"/>
-        </w:rPr>
-        <w:t>platform. The</w:t>
-      </w:r>
-      <w:r>
-        <w:rPr>
-          <w:rFonts w:ascii="Arial" w:hAnsi="Arial" w:cs="Arial"/>
-        </w:rPr>
-        <w:t xml:space="preserve"> system allows users to enter their illness, based on which it recommends nearby specialized doctors and displays the number of patients currently waiting. Users can select a doctor and book appointments online, reducing waiting time and manual effort. </w:t>
-      </w:r>
-    </w:p>
-    <w:p>
-      <w:pPr>
-        <w:spacing w:line="360" w:lineRule="auto"/>
-        <w:jc w:val="both"/>
-        <w:rPr>
-          <w:rFonts w:ascii="Arial" w:hAnsi="Arial" w:cs="Arial"/>
-        </w:rPr>
-      </w:pPr>
-    </w:p>
-    <w:p>
-      <w:pPr>
-        <w:spacing w:line="360" w:lineRule="auto"/>
-        <w:jc w:val="both"/>
-        <w:rPr>
-          <w:rFonts w:ascii="Arial" w:hAnsi="Arial" w:cs="Arial"/>
-        </w:rPr>
-      </w:pPr>
-      <w:r>
-        <w:rPr>
-          <w:rFonts w:ascii="Arial" w:hAnsi="Arial" w:cs="Arial"/>
-        </w:rPr>
-        <w:t xml:space="preserve">The system also identifies nearby pharmacies where prescribed medicines are available and displays their prices, eliminating the need to search multiple medical stores. Integrated map services provide navigation routes to hospitals and pharmacies. A medicine library is included to offer information on medicine usage and requirements. Premium features such as video consultation enable remote interaction with preferred doctors, while prescription-based medicine reminders ensure timely medication intake. </w:t>
-      </w:r>
-    </w:p>
-    <w:p>
-      <w:pPr>
-        <w:spacing w:line="360" w:lineRule="auto"/>
-        <w:jc w:val="both"/>
-        <w:rPr>
-          <w:rFonts w:ascii="Arial" w:hAnsi="Arial" w:cs="Arial"/>
-        </w:rPr>
-      </w:pPr>
-    </w:p>
-    <w:p>
-      <w:pPr>
-        <w:spacing w:line="360" w:lineRule="auto"/>
-        <w:jc w:val="both"/>
-        <w:rPr>
-          <w:rFonts w:ascii="Arial" w:hAnsi="Arial" w:cs="Arial"/>
-        </w:rPr>
-      </w:pPr>
-      <w:r>
-        <w:rPr>
-          <w:rFonts w:ascii="Arial" w:hAnsi="Arial" w:cs="Arial"/>
-        </w:rPr>
-        <w:t xml:space="preserve">Additional intelligent modules include illness suggestion through user prompts and a personal health trainer that provides basic fitness and diet guidance using a conversational bot. An SOS mode supports emergency situations by displaying emergency contact numbers and alerting nearby emergency services. </w:t>
-      </w:r>
-    </w:p>
-    <w:p>
-      <w:pPr>
-        <w:spacing w:line="360" w:lineRule="auto"/>
-        <w:jc w:val="both"/>
-        <w:rPr>
-          <w:rFonts w:ascii="Arial" w:hAnsi="Arial" w:cs="Arial"/>
-        </w:rPr>
-      </w:pPr>
-      <w:r>
-        <w:rPr>
-          <w:rFonts w:ascii="Arial" w:hAnsi="Arial" w:cs="Arial"/>
-        </w:rPr>
-        <w:t>A personalized health dashboard can be included to present an overview of appointments, reminders, and health activities. By combining intelligent recommendations, healthcare navigation, medical knowledge, fitness support, and emergency assistance, the Healthcare Assistant aims to enhance healthcare accessibility, improve patient convenience, and support efficient medical service delivery.</w:t>
-      </w:r>
-    </w:p>
-    <w:p>
-      <w:pPr>
-        <w:spacing w:after="160" w:line="278" w:lineRule="auto"/>
-        <w:rPr>
-          <w:rFonts w:ascii="Arial" w:hAnsi="Arial" w:cs="Arial"/>
           <w:b/>
           <w:bCs/>
           <w:sz w:val="28"/>
           <w:szCs w:val="28"/>
         </w:rPr>
+        <w:lastRenderedPageBreak/>
+        <w:t xml:space="preserve">List of </w:t>
+      </w:r>
+      <w:r>
+        <w:rPr>
+          <w:rFonts w:ascii="Arial" w:hAnsi="Arial" w:cs="Arial"/>
+          <w:b/>
+          <w:bCs/>
+          <w:sz w:val="28"/>
+          <w:szCs w:val="28"/>
+        </w:rPr>
+        <w:t>Abbreviations</w:t>
+      </w:r>
+    </w:p>
+    <w:p>
+      <w:pPr>
+        <w:spacing w:after="160" w:line="360" w:lineRule="auto"/>
+        <w:rPr>
+          <w:rFonts w:ascii="Arial" w:hAnsi="Arial" w:cs="Arial"/>
+          <w:lang w:val="en-IN"/>
+        </w:rPr>
+      </w:pPr>
+      <w:r>
+        <w:rPr>
+          <w:rFonts w:ascii="Arial" w:hAnsi="Arial" w:cs="Arial"/>
+          <w:lang w:val="en-IN"/>
+        </w:rPr>
+        <w:t>AI – Artificial Intelligence</w:t>
+      </w:r>
+    </w:p>
+    <w:p>
+      <w:pPr>
+        <w:spacing w:after="160" w:line="360" w:lineRule="auto"/>
+        <w:rPr>
+          <w:rFonts w:ascii="Arial" w:hAnsi="Arial" w:cs="Arial"/>
+          <w:lang w:val="en-IN"/>
+        </w:rPr>
+      </w:pPr>
+      <w:r>
+        <w:rPr>
+          <w:rFonts w:ascii="Arial" w:hAnsi="Arial" w:cs="Arial"/>
+          <w:lang w:val="en-IN"/>
+        </w:rPr>
+        <w:t>API – Application Programming Interface</w:t>
+      </w:r>
+    </w:p>
+    <w:p>
+      <w:pPr>
+        <w:spacing w:after="160" w:line="360" w:lineRule="auto"/>
+        <w:rPr>
+          <w:rFonts w:ascii="Arial" w:hAnsi="Arial" w:cs="Arial"/>
+          <w:lang w:val="en-IN"/>
+        </w:rPr>
+      </w:pPr>
+      <w:r>
+        <w:rPr>
+          <w:rFonts w:ascii="Arial" w:hAnsi="Arial" w:cs="Arial"/>
+          <w:lang w:val="en-IN"/>
+        </w:rPr>
+        <w:t>API Gateway – Application Programming Interface Gateway</w:t>
+      </w:r>
+    </w:p>
+    <w:p>
+      <w:pPr>
+        <w:spacing w:after="160" w:line="360" w:lineRule="auto"/>
+        <w:rPr>
+          <w:rFonts w:ascii="Arial" w:hAnsi="Arial" w:cs="Arial"/>
+          <w:lang w:val="en-IN"/>
+        </w:rPr>
+      </w:pPr>
+      <w:r>
+        <w:rPr>
+          <w:rFonts w:ascii="Arial" w:hAnsi="Arial" w:cs="Arial"/>
+          <w:lang w:val="en-IN"/>
+        </w:rPr>
+        <w:t>AWS – Amazon Web Services</w:t>
+      </w:r>
+    </w:p>
+    <w:p>
+      <w:pPr>
+        <w:spacing w:after="160" w:line="360" w:lineRule="auto"/>
+        <w:rPr>
+          <w:rFonts w:ascii="Arial" w:hAnsi="Arial" w:cs="Arial"/>
+          <w:lang w:val="en-IN"/>
+        </w:rPr>
+      </w:pPr>
+      <w:r>
+        <w:rPr>
+          <w:rFonts w:ascii="Arial" w:hAnsi="Arial" w:cs="Arial"/>
+          <w:lang w:val="en-IN"/>
+        </w:rPr>
+        <w:t>BCA – Bachelor of Computer Applications</w:t>
+      </w:r>
+    </w:p>
+    <w:p>
+      <w:pPr>
+        <w:spacing w:after="160" w:line="360" w:lineRule="auto"/>
+        <w:rPr>
+          <w:rFonts w:ascii="Arial" w:hAnsi="Arial" w:cs="Arial"/>
+          <w:lang w:val="en-IN"/>
+        </w:rPr>
+      </w:pPr>
+      <w:r>
+        <w:rPr>
+          <w:rFonts w:ascii="Arial" w:hAnsi="Arial" w:cs="Arial"/>
+          <w:lang w:val="en-IN"/>
+        </w:rPr>
+        <w:t>CPU – Central Processing Unit</w:t>
+      </w:r>
+    </w:p>
+    <w:p>
+      <w:pPr>
+        <w:spacing w:after="160" w:line="360" w:lineRule="auto"/>
+        <w:rPr>
+          <w:rFonts w:ascii="Arial" w:hAnsi="Arial" w:cs="Arial"/>
+          <w:lang w:val="en-IN"/>
+        </w:rPr>
+      </w:pPr>
+      <w:r>
+        <w:rPr>
+          <w:rFonts w:ascii="Arial" w:hAnsi="Arial" w:cs="Arial"/>
+          <w:lang w:val="en-IN"/>
+        </w:rPr>
+        <w:t>CRUD – Create, Read, Update, Delete</w:t>
+      </w:r>
+    </w:p>
+    <w:p>
+      <w:pPr>
+        <w:spacing w:after="160" w:line="360" w:lineRule="auto"/>
+        <w:rPr>
+          <w:rFonts w:ascii="Arial" w:hAnsi="Arial" w:cs="Arial"/>
+          <w:lang w:val="en-IN"/>
+        </w:rPr>
+      </w:pPr>
+      <w:r>
+        <w:rPr>
+          <w:rFonts w:ascii="Arial" w:hAnsi="Arial" w:cs="Arial"/>
+          <w:lang w:val="en-IN"/>
+        </w:rPr>
+        <w:t>CSS – Cascading Style Sheets</w:t>
+      </w:r>
+    </w:p>
+    <w:p>
+      <w:pPr>
+        <w:spacing w:after="160" w:line="360" w:lineRule="auto"/>
+        <w:rPr>
+          <w:rFonts w:ascii="Arial" w:hAnsi="Arial" w:cs="Arial"/>
+          <w:lang w:val="en-IN"/>
+        </w:rPr>
+      </w:pPr>
+      <w:r>
+        <w:rPr>
+          <w:rFonts w:ascii="Arial" w:hAnsi="Arial" w:cs="Arial"/>
+          <w:lang w:val="en-IN"/>
+        </w:rPr>
+        <w:t>DB – Database</w:t>
+      </w:r>
+    </w:p>
+    <w:p>
+      <w:pPr>
+        <w:spacing w:after="160" w:line="360" w:lineRule="auto"/>
+        <w:rPr>
+          <w:rFonts w:ascii="Arial" w:hAnsi="Arial" w:cs="Arial"/>
+          <w:lang w:val="en-IN"/>
+        </w:rPr>
+      </w:pPr>
+      <w:r>
+        <w:rPr>
+          <w:rFonts w:ascii="Arial" w:hAnsi="Arial" w:cs="Arial"/>
+          <w:lang w:val="en-IN"/>
+        </w:rPr>
+        <w:t>DFD – Data Flow Diagram</w:t>
+      </w:r>
+    </w:p>
+    <w:p>
+      <w:pPr>
+        <w:spacing w:after="160" w:line="360" w:lineRule="auto"/>
+        <w:rPr>
+          <w:rFonts w:ascii="Arial" w:hAnsi="Arial" w:cs="Arial"/>
+          <w:lang w:val="en-IN"/>
+        </w:rPr>
+      </w:pPr>
+      <w:r>
+        <w:rPr>
+          <w:rFonts w:ascii="Arial" w:hAnsi="Arial" w:cs="Arial"/>
+          <w:lang w:val="en-IN"/>
+        </w:rPr>
+        <w:t>ER – Entity Relationship</w:t>
+      </w:r>
+    </w:p>
+    <w:p>
+      <w:pPr>
+        <w:spacing w:after="160" w:line="360" w:lineRule="auto"/>
+        <w:rPr>
+          <w:rFonts w:ascii="Arial" w:hAnsi="Arial" w:cs="Arial"/>
+          <w:lang w:val="en-IN"/>
+        </w:rPr>
+      </w:pPr>
+      <w:r>
+        <w:rPr>
+          <w:rFonts w:ascii="Arial" w:hAnsi="Arial" w:cs="Arial"/>
+          <w:lang w:val="en-IN"/>
+        </w:rPr>
+        <w:t>Git – Global Information Tracker</w:t>
+      </w:r>
+    </w:p>
+    <w:p>
+      <w:pPr>
+        <w:spacing w:after="160" w:line="360" w:lineRule="auto"/>
+        <w:rPr>
+          <w:rFonts w:ascii="Arial" w:hAnsi="Arial" w:cs="Arial"/>
+          <w:lang w:val="en-IN"/>
+        </w:rPr>
+      </w:pPr>
+      <w:r>
+        <w:rPr>
+          <w:rFonts w:ascii="Arial" w:hAnsi="Arial" w:cs="Arial"/>
+          <w:lang w:val="en-IN"/>
+        </w:rPr>
+        <w:t>GPS – Global Positioning System</w:t>
+      </w:r>
+    </w:p>
+    <w:p>
+      <w:pPr>
+        <w:spacing w:after="160" w:line="360" w:lineRule="auto"/>
+        <w:rPr>
+          <w:rFonts w:ascii="Arial" w:hAnsi="Arial" w:cs="Arial"/>
+          <w:lang w:val="en-IN"/>
+        </w:rPr>
+      </w:pPr>
+      <w:r>
+        <w:rPr>
+          <w:rFonts w:ascii="Arial" w:hAnsi="Arial" w:cs="Arial"/>
+          <w:lang w:val="en-IN"/>
+        </w:rPr>
+        <w:t xml:space="preserve">HTML – </w:t>
+      </w:r>
+      <w:proofErr w:type="spellStart"/>
+      <w:r>
+        <w:rPr>
+          <w:rFonts w:ascii="Arial" w:hAnsi="Arial" w:cs="Arial"/>
+          <w:lang w:val="en-IN"/>
+        </w:rPr>
+        <w:t>HyperText</w:t>
+      </w:r>
+      <w:proofErr w:type="spellEnd"/>
+      <w:r>
+        <w:rPr>
+          <w:rFonts w:ascii="Arial" w:hAnsi="Arial" w:cs="Arial"/>
+          <w:lang w:val="en-IN"/>
+        </w:rPr>
+        <w:t xml:space="preserve"> Markup Language</w:t>
+      </w:r>
+    </w:p>
+    <w:p>
+      <w:pPr>
+        <w:spacing w:after="160" w:line="360" w:lineRule="auto"/>
+        <w:rPr>
+          <w:rFonts w:ascii="Arial" w:hAnsi="Arial" w:cs="Arial"/>
+          <w:lang w:val="en-IN"/>
+        </w:rPr>
+      </w:pPr>
+      <w:r>
+        <w:rPr>
+          <w:rFonts w:ascii="Arial" w:hAnsi="Arial" w:cs="Arial"/>
+          <w:lang w:val="en-IN"/>
+        </w:rPr>
+        <w:t xml:space="preserve">HTTP – </w:t>
+      </w:r>
+      <w:proofErr w:type="spellStart"/>
+      <w:r>
+        <w:rPr>
+          <w:rFonts w:ascii="Arial" w:hAnsi="Arial" w:cs="Arial"/>
+          <w:lang w:val="en-IN"/>
+        </w:rPr>
+        <w:t>HyperText</w:t>
+      </w:r>
+      <w:proofErr w:type="spellEnd"/>
+      <w:r>
+        <w:rPr>
+          <w:rFonts w:ascii="Arial" w:hAnsi="Arial" w:cs="Arial"/>
+          <w:lang w:val="en-IN"/>
+        </w:rPr>
+        <w:t xml:space="preserve"> Transfer Protocol</w:t>
+      </w:r>
+    </w:p>
+    <w:p>
+      <w:pPr>
+        <w:spacing w:after="160" w:line="360" w:lineRule="auto"/>
+        <w:rPr>
+          <w:rFonts w:ascii="Arial" w:hAnsi="Arial" w:cs="Arial"/>
+          <w:lang w:val="en-IN"/>
+        </w:rPr>
+      </w:pPr>
+      <w:r>
+        <w:rPr>
+          <w:rFonts w:ascii="Arial" w:hAnsi="Arial" w:cs="Arial"/>
+          <w:lang w:val="en-IN"/>
+        </w:rPr>
+        <w:t xml:space="preserve">HTTPS – </w:t>
+      </w:r>
+      <w:proofErr w:type="spellStart"/>
+      <w:r>
+        <w:rPr>
+          <w:rFonts w:ascii="Arial" w:hAnsi="Arial" w:cs="Arial"/>
+          <w:lang w:val="en-IN"/>
+        </w:rPr>
+        <w:t>HyperText</w:t>
+      </w:r>
+      <w:proofErr w:type="spellEnd"/>
+      <w:r>
+        <w:rPr>
+          <w:rFonts w:ascii="Arial" w:hAnsi="Arial" w:cs="Arial"/>
+          <w:lang w:val="en-IN"/>
+        </w:rPr>
+        <w:t xml:space="preserve"> Transfer Protocol Secure</w:t>
+      </w:r>
+    </w:p>
+    <w:p>
+      <w:pPr>
+        <w:spacing w:after="160" w:line="360" w:lineRule="auto"/>
+        <w:rPr>
+          <w:rFonts w:ascii="Arial" w:hAnsi="Arial" w:cs="Arial"/>
+          <w:lang w:val="en-IN"/>
+        </w:rPr>
+      </w:pPr>
+      <w:r>
+        <w:rPr>
+          <w:rFonts w:ascii="Arial" w:hAnsi="Arial" w:cs="Arial"/>
+          <w:lang w:val="en-IN"/>
+        </w:rPr>
+        <w:t>IDE – Integrated Development Environment</w:t>
+      </w:r>
+    </w:p>
+    <w:p>
+      <w:pPr>
+        <w:spacing w:after="160" w:line="360" w:lineRule="auto"/>
+        <w:rPr>
+          <w:rFonts w:ascii="Arial" w:hAnsi="Arial" w:cs="Arial"/>
+          <w:lang w:val="en-IN"/>
+        </w:rPr>
+      </w:pPr>
+      <w:r>
+        <w:rPr>
+          <w:rFonts w:ascii="Arial" w:hAnsi="Arial" w:cs="Arial"/>
+          <w:lang w:val="en-IN"/>
+        </w:rPr>
+        <w:t>JSON – JavaScript Object Notation</w:t>
+      </w:r>
+    </w:p>
+    <w:p>
+      <w:pPr>
+        <w:spacing w:after="160" w:line="360" w:lineRule="auto"/>
+        <w:rPr>
+          <w:rFonts w:ascii="Arial" w:hAnsi="Arial" w:cs="Arial"/>
+          <w:lang w:val="en-IN"/>
+        </w:rPr>
+      </w:pPr>
+      <w:r>
+        <w:rPr>
+          <w:rFonts w:ascii="Arial" w:hAnsi="Arial" w:cs="Arial"/>
+          <w:lang w:val="en-IN"/>
+        </w:rPr>
+        <w:t>JS – JavaScript</w:t>
+      </w:r>
+    </w:p>
+    <w:p>
+      <w:pPr>
+        <w:spacing w:after="160" w:line="360" w:lineRule="auto"/>
+        <w:rPr>
+          <w:rFonts w:ascii="Arial" w:hAnsi="Arial" w:cs="Arial"/>
+          <w:lang w:val="en-IN"/>
+        </w:rPr>
+      </w:pPr>
+      <w:r>
+        <w:rPr>
+          <w:rFonts w:ascii="Arial" w:hAnsi="Arial" w:cs="Arial"/>
+          <w:lang w:val="en-IN"/>
+        </w:rPr>
+        <w:t>JWT – JSON Web Token</w:t>
+      </w:r>
+    </w:p>
+    <w:p>
+      <w:pPr>
+        <w:spacing w:after="160" w:line="360" w:lineRule="auto"/>
+        <w:rPr>
+          <w:rFonts w:ascii="Arial" w:hAnsi="Arial" w:cs="Arial"/>
+          <w:lang w:val="en-IN"/>
+        </w:rPr>
+      </w:pPr>
+      <w:r>
+        <w:rPr>
+          <w:rFonts w:ascii="Arial" w:hAnsi="Arial" w:cs="Arial"/>
+          <w:lang w:val="en-IN"/>
+        </w:rPr>
+        <w:t>ML – Machine Learning</w:t>
+      </w:r>
+    </w:p>
+    <w:p>
+      <w:pPr>
+        <w:spacing w:after="160" w:line="360" w:lineRule="auto"/>
+        <w:rPr>
+          <w:rFonts w:ascii="Arial" w:hAnsi="Arial" w:cs="Arial"/>
+          <w:lang w:val="en-IN"/>
+        </w:rPr>
+      </w:pPr>
+      <w:r>
+        <w:rPr>
+          <w:rFonts w:ascii="Arial" w:hAnsi="Arial" w:cs="Arial"/>
+          <w:lang w:val="en-IN"/>
+        </w:rPr>
+        <w:t>MVC – Model View Controller</w:t>
+      </w:r>
+    </w:p>
+    <w:p>
+      <w:pPr>
+        <w:spacing w:after="160" w:line="360" w:lineRule="auto"/>
+        <w:rPr>
+          <w:rFonts w:ascii="Arial" w:hAnsi="Arial" w:cs="Arial"/>
+          <w:lang w:val="en-IN"/>
+        </w:rPr>
+      </w:pPr>
+      <w:r>
+        <w:rPr>
+          <w:rFonts w:ascii="Arial" w:hAnsi="Arial" w:cs="Arial"/>
+          <w:lang w:val="en-IN"/>
+        </w:rPr>
+        <w:t>NoSQL – Not Only Structured Query Language</w:t>
+      </w:r>
+    </w:p>
+    <w:p>
+      <w:pPr>
+        <w:spacing w:after="160" w:line="360" w:lineRule="auto"/>
+        <w:rPr>
+          <w:rFonts w:ascii="Arial" w:hAnsi="Arial" w:cs="Arial"/>
+          <w:lang w:val="en-IN"/>
+        </w:rPr>
+      </w:pPr>
+      <w:r>
+        <w:rPr>
+          <w:rFonts w:ascii="Arial" w:hAnsi="Arial" w:cs="Arial"/>
+          <w:lang w:val="en-IN"/>
+        </w:rPr>
+        <w:t>NPM – Node Package Manager</w:t>
+      </w:r>
+    </w:p>
+    <w:p>
+      <w:pPr>
+        <w:spacing w:after="160" w:line="360" w:lineRule="auto"/>
+        <w:rPr>
+          <w:rFonts w:ascii="Arial" w:hAnsi="Arial" w:cs="Arial"/>
+          <w:lang w:val="en-IN"/>
+        </w:rPr>
+      </w:pPr>
+      <w:r>
+        <w:rPr>
+          <w:rFonts w:ascii="Arial" w:hAnsi="Arial" w:cs="Arial"/>
+          <w:lang w:val="en-IN"/>
+        </w:rPr>
+        <w:lastRenderedPageBreak/>
+        <w:t>OS – Operating System</w:t>
+      </w:r>
+    </w:p>
+    <w:p>
+      <w:pPr>
+        <w:spacing w:after="160" w:line="360" w:lineRule="auto"/>
+        <w:rPr>
+          <w:rFonts w:ascii="Arial" w:hAnsi="Arial" w:cs="Arial"/>
+          <w:lang w:val="en-IN"/>
+        </w:rPr>
+      </w:pPr>
+      <w:r>
+        <w:rPr>
+          <w:rFonts w:ascii="Arial" w:hAnsi="Arial" w:cs="Arial"/>
+          <w:lang w:val="en-IN"/>
+        </w:rPr>
+        <w:t>RAM – Random Access Memory</w:t>
+      </w:r>
+    </w:p>
+    <w:p>
+      <w:pPr>
+        <w:spacing w:after="160" w:line="360" w:lineRule="auto"/>
+        <w:rPr>
+          <w:rFonts w:ascii="Arial" w:hAnsi="Arial" w:cs="Arial"/>
+          <w:lang w:val="en-IN"/>
+        </w:rPr>
+      </w:pPr>
+      <w:r>
+        <w:rPr>
+          <w:rFonts w:ascii="Arial" w:hAnsi="Arial" w:cs="Arial"/>
+          <w:lang w:val="en-IN"/>
+        </w:rPr>
+        <w:t>REST – Representational State Transfer</w:t>
+      </w:r>
+    </w:p>
+    <w:p>
+      <w:pPr>
+        <w:spacing w:after="160" w:line="360" w:lineRule="auto"/>
+        <w:rPr>
+          <w:rFonts w:ascii="Arial" w:hAnsi="Arial" w:cs="Arial"/>
+          <w:lang w:val="en-IN"/>
+        </w:rPr>
+      </w:pPr>
+      <w:r>
+        <w:rPr>
+          <w:rFonts w:ascii="Arial" w:hAnsi="Arial" w:cs="Arial"/>
+          <w:lang w:val="en-IN"/>
+        </w:rPr>
+        <w:t>SOS – Save Our Souls (Emergency Signal)</w:t>
+      </w:r>
+    </w:p>
+    <w:p>
+      <w:pPr>
+        <w:spacing w:after="160" w:line="360" w:lineRule="auto"/>
+        <w:rPr>
+          <w:rFonts w:ascii="Arial" w:hAnsi="Arial" w:cs="Arial"/>
+          <w:lang w:val="en-IN"/>
+        </w:rPr>
+      </w:pPr>
+      <w:r>
+        <w:rPr>
+          <w:rFonts w:ascii="Arial" w:hAnsi="Arial" w:cs="Arial"/>
+          <w:lang w:val="en-IN"/>
+        </w:rPr>
+        <w:t>SPA – Single Page Application</w:t>
+      </w:r>
+    </w:p>
+    <w:p>
+      <w:pPr>
+        <w:spacing w:after="160" w:line="360" w:lineRule="auto"/>
+        <w:rPr>
+          <w:rFonts w:ascii="Arial" w:hAnsi="Arial" w:cs="Arial"/>
+          <w:lang w:val="en-IN"/>
+        </w:rPr>
+      </w:pPr>
+      <w:r>
+        <w:rPr>
+          <w:rFonts w:ascii="Arial" w:hAnsi="Arial" w:cs="Arial"/>
+          <w:lang w:val="en-IN"/>
+        </w:rPr>
+        <w:t>UI – User Interface</w:t>
+      </w:r>
+    </w:p>
+    <w:p>
+      <w:pPr>
+        <w:spacing w:after="160" w:line="360" w:lineRule="auto"/>
+        <w:rPr>
+          <w:rFonts w:ascii="Arial" w:hAnsi="Arial" w:cs="Arial"/>
+          <w:lang w:val="en-IN"/>
+        </w:rPr>
+      </w:pPr>
+      <w:r>
+        <w:rPr>
+          <w:rFonts w:ascii="Arial" w:hAnsi="Arial" w:cs="Arial"/>
+          <w:lang w:val="en-IN"/>
+        </w:rPr>
+        <w:t xml:space="preserve">UML – Unified </w:t>
+      </w:r>
+      <w:proofErr w:type="spellStart"/>
+      <w:r>
+        <w:rPr>
+          <w:rFonts w:ascii="Arial" w:hAnsi="Arial" w:cs="Arial"/>
+          <w:lang w:val="en-IN"/>
+        </w:rPr>
+        <w:t>Modeling</w:t>
+      </w:r>
+      <w:proofErr w:type="spellEnd"/>
+      <w:r>
+        <w:rPr>
+          <w:rFonts w:ascii="Arial" w:hAnsi="Arial" w:cs="Arial"/>
+          <w:lang w:val="en-IN"/>
+        </w:rPr>
+        <w:t xml:space="preserve"> Language</w:t>
+      </w:r>
+    </w:p>
+    <w:p>
+      <w:pPr>
+        <w:spacing w:after="160" w:line="360" w:lineRule="auto"/>
+        <w:rPr>
+          <w:rFonts w:ascii="Arial" w:hAnsi="Arial" w:cs="Arial"/>
+          <w:lang w:val="en-IN"/>
+        </w:rPr>
+      </w:pPr>
+      <w:r>
+        <w:rPr>
+          <w:rFonts w:ascii="Arial" w:hAnsi="Arial" w:cs="Arial"/>
+          <w:lang w:val="en-IN"/>
+        </w:rPr>
+        <w:t>URL – Uniform Resource Locator</w:t>
+      </w:r>
+    </w:p>
+    <w:p>
+      <w:pPr>
+        <w:spacing w:after="160" w:line="360" w:lineRule="auto"/>
+        <w:rPr>
+          <w:rFonts w:ascii="Arial" w:hAnsi="Arial" w:cs="Arial"/>
+          <w:lang w:val="en-IN"/>
+        </w:rPr>
+      </w:pPr>
+      <w:r>
+        <w:rPr>
+          <w:rFonts w:ascii="Arial" w:hAnsi="Arial" w:cs="Arial"/>
+          <w:lang w:val="en-IN"/>
+        </w:rPr>
+        <w:t>UX – User Experience</w:t>
+      </w:r>
+    </w:p>
+    <w:p>
+      <w:pPr>
+        <w:spacing w:after="160" w:line="360" w:lineRule="auto"/>
+        <w:rPr>
+          <w:rFonts w:ascii="Arial" w:hAnsi="Arial" w:cs="Arial"/>
+          <w:lang w:val="en-IN"/>
+        </w:rPr>
+      </w:pPr>
+      <w:r>
+        <w:rPr>
+          <w:rFonts w:ascii="Arial" w:hAnsi="Arial" w:cs="Arial"/>
+          <w:lang w:val="en-IN"/>
+        </w:rPr>
+        <w:t>VS Code – Visual Studio Code</w:t>
+      </w:r>
+    </w:p>
+    <w:p>
+      <w:pPr>
+        <w:spacing w:after="160" w:line="278" w:lineRule="auto"/>
+        <w:rPr>
+          <w:rFonts w:ascii="Arial" w:hAnsi="Arial" w:cs="Arial"/>
+          <w:b/>
+          <w:bCs/>
+          <w:sz w:val="28"/>
+          <w:szCs w:val="28"/>
+        </w:rPr>
+      </w:pPr>
+      <w:r>
+        <w:br w:type="page"/>
+      </w:r>
+    </w:p>
+    <w:p>
+      <w:pPr>
+        <w:pStyle w:val="HHHHHH"/>
+      </w:pPr>
+      <w:r>
+        <w:lastRenderedPageBreak/>
+        <w:t>ABSTRACT</w:t>
+      </w:r>
+    </w:p>
+    <w:p>
+      <w:pPr>
+        <w:spacing w:line="360" w:lineRule="auto"/>
+        <w:jc w:val="both"/>
+        <w:rPr>
+          <w:rFonts w:ascii="Arial" w:hAnsi="Arial" w:cs="Arial"/>
+        </w:rPr>
+      </w:pPr>
+    </w:p>
+    <w:p>
+      <w:pPr>
+        <w:spacing w:line="360" w:lineRule="auto"/>
+        <w:jc w:val="both"/>
+        <w:rPr>
+          <w:rFonts w:ascii="Arial" w:hAnsi="Arial" w:cs="Arial"/>
+        </w:rPr>
+      </w:pPr>
+      <w:r>
+        <w:rPr>
+          <w:rFonts w:ascii="Arial" w:hAnsi="Arial" w:cs="Arial"/>
+        </w:rPr>
+        <w:t xml:space="preserve">Accessing timely healthcare services is often challenging due to lack of medical awareness, difficulty in finding suitable doctors, long waiting times, and scattered healthcare resources. BAYMAX is an intelligent, user-centric system designed to simplify healthcare access by integrating doctor recommendation, appointment booking, pharmacy assistance, navigation, health guidance, and emergency support into a single </w:t>
+      </w:r>
+      <w:r>
+        <w:rPr>
+          <w:rFonts w:ascii="Arial" w:hAnsi="Arial" w:cs="Arial"/>
+        </w:rPr>
+        <w:t>platform. The</w:t>
+      </w:r>
+      <w:r>
+        <w:rPr>
+          <w:rFonts w:ascii="Arial" w:hAnsi="Arial" w:cs="Arial"/>
+        </w:rPr>
+        <w:t xml:space="preserve"> system allows users to enter their illness, based on which it recommends nearby specialized doctors and displays the number of patients currently waiting. Users can select a doctor and book appointments online, reducing waiting time and manual effort. </w:t>
+      </w:r>
+    </w:p>
+    <w:p>
+      <w:pPr>
+        <w:spacing w:line="360" w:lineRule="auto"/>
+        <w:jc w:val="both"/>
+        <w:rPr>
+          <w:rFonts w:ascii="Arial" w:hAnsi="Arial" w:cs="Arial"/>
+        </w:rPr>
+      </w:pPr>
+    </w:p>
+    <w:p>
+      <w:pPr>
+        <w:spacing w:line="360" w:lineRule="auto"/>
+        <w:jc w:val="both"/>
+        <w:rPr>
+          <w:rFonts w:ascii="Arial" w:hAnsi="Arial" w:cs="Arial"/>
+        </w:rPr>
+      </w:pPr>
+      <w:r>
+        <w:rPr>
+          <w:rFonts w:ascii="Arial" w:hAnsi="Arial" w:cs="Arial"/>
+        </w:rPr>
+        <w:t xml:space="preserve">The system also identifies nearby pharmacies where prescribed medicines are available and displays their prices, eliminating the need to search multiple medical stores. Integrated map services provide navigation routes to hospitals and pharmacies. A medicine library is included to offer information on medicine usage and requirements. Premium features such as video consultation enable remote interaction with preferred doctors, while prescription-based medicine reminders ensure timely medication intake. </w:t>
+      </w:r>
+    </w:p>
+    <w:p>
+      <w:pPr>
+        <w:spacing w:line="360" w:lineRule="auto"/>
+        <w:jc w:val="both"/>
+        <w:rPr>
+          <w:rFonts w:ascii="Arial" w:hAnsi="Arial" w:cs="Arial"/>
+        </w:rPr>
+      </w:pPr>
+    </w:p>
+    <w:p>
+      <w:pPr>
+        <w:spacing w:line="360" w:lineRule="auto"/>
+        <w:jc w:val="both"/>
+        <w:rPr>
+          <w:rFonts w:ascii="Arial" w:hAnsi="Arial" w:cs="Arial"/>
+        </w:rPr>
+      </w:pPr>
+      <w:r>
+        <w:rPr>
+          <w:rFonts w:ascii="Arial" w:hAnsi="Arial" w:cs="Arial"/>
+        </w:rPr>
+        <w:t xml:space="preserve">Additional intelligent modules include illness suggestion through user prompts and a personal health trainer that provides basic fitness and diet guidance using a conversational bot. An SOS mode supports emergency situations by displaying emergency contact numbers and alerting nearby emergency services. </w:t>
+      </w:r>
+    </w:p>
+    <w:p>
+      <w:pPr>
+        <w:spacing w:line="360" w:lineRule="auto"/>
+        <w:jc w:val="both"/>
+        <w:rPr>
+          <w:rFonts w:ascii="Arial" w:hAnsi="Arial" w:cs="Arial"/>
+        </w:rPr>
+      </w:pPr>
+      <w:r>
+        <w:rPr>
+          <w:rFonts w:ascii="Arial" w:hAnsi="Arial" w:cs="Arial"/>
+        </w:rPr>
+        <w:t>A personalized health dashboard can be included to present an overview of appointments, reminders, and health activities. By combining intelligent recommendations, healthcare navigation, medical knowledge, fitness support, and emergency assistance, the Healthcare Assistant aims to enhance healthcare accessibility, improve patient convenience, and support efficient medical service delivery.</w:t>
+      </w:r>
+    </w:p>
+    <w:p>
+      <w:pPr>
+        <w:spacing w:after="160" w:line="278" w:lineRule="auto"/>
+        <w:rPr>
+          <w:rFonts w:ascii="Arial" w:hAnsi="Arial" w:cs="Arial"/>
+          <w:b/>
+          <w:bCs/>
+          <w:sz w:val="28"/>
+          <w:szCs w:val="28"/>
+        </w:rPr>
       </w:pPr>
       <w:r>
         <w:rPr>
@@ -5796,6 +7313,10 @@
     <w:p>
       <w:pPr>
         <w:pStyle w:val="HHHHHH"/>
+        <w:rPr>
+          <w:sz w:val="24"/>
+          <w:szCs w:val="24"/>
+        </w:rPr>
       </w:pPr>
     </w:p>
     <w:p>
@@ -6784,15 +8305,13 @@
         </w:rPr>
         <w:t xml:space="preserve">This chapter presented a review of existing healthcare platforms, technologies, and research related to digital healthcare systems. The study </w:t>
       </w:r>
-      <w:proofErr w:type="spellStart"/>
-      <w:r>
-        <w:rPr>
-          <w:rFonts w:ascii="Arial" w:hAnsi="Arial" w:cs="Arial"/>
-          <w:lang w:val="en-IN"/>
-        </w:rPr>
-        <w:t>analyzed</w:t>
-      </w:r>
-      <w:proofErr w:type="spellEnd"/>
+      <w:r>
+        <w:rPr>
+          <w:rFonts w:ascii="Arial" w:hAnsi="Arial" w:cs="Arial"/>
+          <w:lang w:val="en-IN"/>
+        </w:rPr>
+        <w:t>analysed</w:t>
+      </w:r>
       <w:r>
         <w:rPr>
           <w:rFonts w:ascii="Arial" w:hAnsi="Arial" w:cs="Arial"/>
@@ -9391,23 +10910,7 @@
           <w:iCs/>
           <w:lang w:val="en-IN"/>
         </w:rPr>
-        <w:t xml:space="preserve">Additionally, RESTful APIs are used to enable seamless communication between client and server, ensuring efficient data exchange and faster response </w:t>
-      </w:r>
-      <w:r>
-        <w:rPr>
-          <w:i w:val="0"/>
-          <w:iCs/>
-          <w:lang w:val="en-IN"/>
-        </w:rPr>
-        <w:t>times. The</w:t>
-      </w:r>
-      <w:r>
-        <w:rPr>
-          <w:i w:val="0"/>
-          <w:iCs/>
-          <w:lang w:val="en-IN"/>
-        </w:rPr>
-        <w:t xml:space="preserve"> system is designed with scalability in mind, allowing it to handle increasing numbers of users and data without performance degradation. Load balancing and efficient database queries further enhance system performance. Security is also integrated into the architecture through authentication mechanisms and encrypted communication protocols. </w:t>
+        <w:t xml:space="preserve">Additionally, RESTful APIs are used to enable seamless communication between client and server, ensuring efficient data exchange and faster response times. The system is designed with scalability in mind, allowing it to handle increasing numbers of users and data without performance degradation. Load balancing and efficient database queries further enhance system performance. Security is also integrated into the architecture through authentication mechanisms and encrypted communication protocols. </w:t>
       </w:r>
     </w:p>
     <w:p>
@@ -9796,6 +11299,7 @@
         </w:rPr>
       </w:pPr>
       <w:bookmarkStart w:id="3" w:name="_Toc225964844"/>
+      <w:bookmarkStart w:id="4" w:name="_Toc225973961"/>
       <w:r>
         <w:rPr>
           <w:rFonts w:ascii="Arial" w:hAnsi="Arial" w:cs="Arial"/>
@@ -9875,6 +11379,7 @@
         <w:t>: Architecture Diagram</w:t>
       </w:r>
       <w:bookmarkEnd w:id="3"/>
+      <w:bookmarkEnd w:id="4"/>
     </w:p>
     <w:p>
       <w:pPr>
@@ -10743,7 +12248,8 @@
           <w:szCs w:val="24"/>
         </w:rPr>
       </w:pPr>
-      <w:bookmarkStart w:id="4" w:name="_Toc225964845"/>
+      <w:bookmarkStart w:id="5" w:name="_Toc225964845"/>
+      <w:bookmarkStart w:id="6" w:name="_Toc225973962"/>
       <w:r>
         <w:rPr>
           <w:rFonts w:ascii="Arial" w:hAnsi="Arial" w:cs="Arial"/>
@@ -10822,7 +12328,8 @@
         </w:rPr>
         <w:t>: Data Flow Diagram</w:t>
       </w:r>
-      <w:bookmarkEnd w:id="4"/>
+      <w:bookmarkEnd w:id="5"/>
+      <w:bookmarkEnd w:id="6"/>
     </w:p>
     <w:p>
       <w:pPr>
@@ -11478,7 +12985,7 @@
           <w:noProof/>
         </w:rPr>
         <w:drawing>
-          <wp:inline distT="0" distB="0" distL="0" distR="0" wp14:anchorId="0F03E5EE" wp14:editId="3E2F1E5C">
+          <wp:inline distT="0" distB="0" distL="0" distR="0" wp14:anchorId="0F03E5EE" wp14:editId="7BED5108">
             <wp:extent cx="5723890" cy="3218180"/>
             <wp:effectExtent l="0" t="0" r="0" b="1270"/>
             <wp:docPr id="1245409552" name="Picture 3"/>
@@ -11540,7 +13047,8 @@
           <w:szCs w:val="24"/>
         </w:rPr>
       </w:pPr>
-      <w:bookmarkStart w:id="5" w:name="_Toc225964846"/>
+      <w:bookmarkStart w:id="7" w:name="_Toc225964846"/>
+      <w:bookmarkStart w:id="8" w:name="_Toc225973963"/>
       <w:r>
         <w:rPr>
           <w:rFonts w:ascii="Arial" w:hAnsi="Arial" w:cs="Arial"/>
@@ -11619,7 +13127,8 @@
         </w:rPr>
         <w:t>: UML Diagram: Use Case</w:t>
       </w:r>
-      <w:bookmarkEnd w:id="5"/>
+      <w:bookmarkEnd w:id="7"/>
+      <w:bookmarkEnd w:id="8"/>
     </w:p>
     <w:p>
       <w:pPr>
@@ -11814,21 +13323,7 @@
           <w:rFonts w:ascii="Arial" w:hAnsi="Arial" w:cs="Arial"/>
           <w:lang w:val="en-IN"/>
         </w:rPr>
-        <w:t xml:space="preserve">From an operational perspective, the system is designed to be user-friendly and easy to use, requiring minimal technical knowledge. This ensures that users from different backgrounds can access healthcare services without difficulty. The economic feasibility of the system is also </w:t>
-      </w:r>
-      <w:r>
-        <w:rPr>
-          <w:rFonts w:ascii="Arial" w:hAnsi="Arial" w:cs="Arial"/>
-          <w:lang w:val="en-IN"/>
-        </w:rPr>
-        <w:t>favourable</w:t>
-      </w:r>
-      <w:r>
-        <w:rPr>
-          <w:rFonts w:ascii="Arial" w:hAnsi="Arial" w:cs="Arial"/>
-          <w:lang w:val="en-IN"/>
-        </w:rPr>
-        <w:t>, as it utilizes open-source technologies and tools, reducing development and maintenance costs.</w:t>
+        <w:t>From an operational perspective, the system is designed to be user-friendly and easy to use, requiring minimal technical knowledge. This ensures that users from different backgrounds can access healthcare services without difficulty. The economic feasibility of the system is also favourable, as it utilizes open-source technologies and tools, reducing development and maintenance costs.</w:t>
       </w:r>
     </w:p>
     <w:p>
@@ -12579,7 +14074,7 @@
           <w:lang w:val="en-IN"/>
         </w:rPr>
       </w:pPr>
-      <w:bookmarkStart w:id="6" w:name="_Toc225601485"/>
+      <w:bookmarkStart w:id="9" w:name="_Toc225601485"/>
       <w:r>
         <w:rPr>
           <w:rFonts w:ascii="Arial" w:hAnsi="Arial" w:cs="Arial"/>
@@ -12672,7 +14167,7 @@
         </w:rPr>
         <w:t>: Module Testing Result</w:t>
       </w:r>
-      <w:bookmarkEnd w:id="6"/>
+      <w:bookmarkEnd w:id="9"/>
     </w:p>
     <w:tbl>
       <w:tblPr>
@@ -13303,21 +14798,7 @@
           <w:rFonts w:ascii="Arial" w:hAnsi="Arial" w:cs="Arial"/>
           <w:lang w:val="en-IN"/>
         </w:rPr>
-        <w:t xml:space="preserve">The system also showed efficient memory usage and minimal latency during operations, ensuring a smooth user experience. Stress testing was conducted to evaluate system </w:t>
-      </w:r>
-      <w:r>
-        <w:rPr>
-          <w:rFonts w:ascii="Arial" w:hAnsi="Arial" w:cs="Arial"/>
-          <w:lang w:val="en-IN"/>
-        </w:rPr>
-        <w:t>behaviour</w:t>
-      </w:r>
-      <w:r>
-        <w:rPr>
-          <w:rFonts w:ascii="Arial" w:hAnsi="Arial" w:cs="Arial"/>
-          <w:lang w:val="en-IN"/>
-        </w:rPr>
-        <w:t xml:space="preserve"> under high load conditions, and the results indicated that the system can handle increased user traffic without major performance degradation. The use of modern web technologies and efficient backend processing contributes to the overall responsiveness and reliability of the system.</w:t>
+        <w:t>The system also showed efficient memory usage and minimal latency during operations, ensuring a smooth user experience. Stress testing was conducted to evaluate system behaviour under high load conditions, and the results indicated that the system can handle increased user traffic without major performance degradation. The use of modern web technologies and efficient backend processing contributes to the overall responsiveness and reliability of the system.</w:t>
       </w:r>
     </w:p>
     <w:p>
@@ -13383,7 +14864,7 @@
           <w:szCs w:val="24"/>
         </w:rPr>
       </w:pPr>
-      <w:bookmarkStart w:id="7" w:name="_Toc225601486"/>
+      <w:bookmarkStart w:id="10" w:name="_Toc225601486"/>
       <w:r>
         <w:rPr>
           <w:rFonts w:ascii="Arial" w:hAnsi="Arial" w:cs="Arial"/>
@@ -13476,7 +14957,7 @@
         </w:rPr>
         <w:t>: Comparison Features</w:t>
       </w:r>
-      <w:bookmarkEnd w:id="7"/>
+      <w:bookmarkEnd w:id="10"/>
     </w:p>
     <w:tbl>
       <w:tblPr>
@@ -15324,6 +16805,87 @@
     </w:p>
     <w:p>
       <w:pPr>
+        <w:pStyle w:val="Caption"/>
+        <w:jc w:val="center"/>
+        <w:rPr>
+          <w:rFonts w:ascii="Arial" w:hAnsi="Arial" w:cs="Arial"/>
+          <w:b/>
+          <w:bCs/>
+          <w:color w:val="auto"/>
+          <w:sz w:val="24"/>
+          <w:szCs w:val="24"/>
+          <w:lang w:val="en-IN"/>
+        </w:rPr>
+      </w:pPr>
+      <w:bookmarkStart w:id="11" w:name="_Toc225973964"/>
+      <w:r>
+        <w:rPr>
+          <w:rFonts w:ascii="Arial" w:hAnsi="Arial" w:cs="Arial"/>
+          <w:color w:val="auto"/>
+          <w:sz w:val="24"/>
+          <w:szCs w:val="24"/>
+        </w:rPr>
+        <w:t xml:space="preserve">Figure </w:t>
+      </w:r>
+      <w:r>
+        <w:rPr>
+          <w:rFonts w:ascii="Arial" w:hAnsi="Arial" w:cs="Arial"/>
+          <w:color w:val="auto"/>
+          <w:sz w:val="24"/>
+          <w:szCs w:val="24"/>
+        </w:rPr>
+        <w:fldChar w:fldCharType="begin"/>
+      </w:r>
+      <w:r>
+        <w:rPr>
+          <w:rFonts w:ascii="Arial" w:hAnsi="Arial" w:cs="Arial"/>
+          <w:color w:val="auto"/>
+          <w:sz w:val="24"/>
+          <w:szCs w:val="24"/>
+        </w:rPr>
+        <w:instrText xml:space="preserve"> SEQ Figure \* ARABIC </w:instrText>
+      </w:r>
+      <w:r>
+        <w:rPr>
+          <w:rFonts w:ascii="Arial" w:hAnsi="Arial" w:cs="Arial"/>
+          <w:color w:val="auto"/>
+          <w:sz w:val="24"/>
+          <w:szCs w:val="24"/>
+        </w:rPr>
+        <w:fldChar w:fldCharType="separate"/>
+      </w:r>
+      <w:r>
+        <w:rPr>
+          <w:rFonts w:ascii="Arial" w:hAnsi="Arial" w:cs="Arial"/>
+          <w:noProof/>
+          <w:color w:val="auto"/>
+          <w:sz w:val="24"/>
+          <w:szCs w:val="24"/>
+        </w:rPr>
+        <w:t>4</w:t>
+      </w:r>
+      <w:r>
+        <w:rPr>
+          <w:rFonts w:ascii="Arial" w:hAnsi="Arial" w:cs="Arial"/>
+          <w:color w:val="auto"/>
+          <w:sz w:val="24"/>
+          <w:szCs w:val="24"/>
+        </w:rPr>
+        <w:fldChar w:fldCharType="end"/>
+      </w:r>
+      <w:r>
+        <w:rPr>
+          <w:rFonts w:ascii="Arial" w:hAnsi="Arial" w:cs="Arial"/>
+          <w:color w:val="auto"/>
+          <w:sz w:val="24"/>
+          <w:szCs w:val="24"/>
+        </w:rPr>
+        <w:t>: Home Page</w:t>
+      </w:r>
+      <w:bookmarkEnd w:id="11"/>
+    </w:p>
+    <w:p>
+      <w:pPr>
         <w:spacing w:after="160" w:line="360" w:lineRule="auto"/>
         <w:ind w:left="720"/>
         <w:jc w:val="both"/>
@@ -15499,6 +17061,105 @@
     </w:p>
     <w:p>
       <w:pPr>
+        <w:pStyle w:val="Caption"/>
+        <w:jc w:val="center"/>
+        <w:rPr>
+          <w:rFonts w:ascii="Arial" w:hAnsi="Arial" w:cs="Arial"/>
+          <w:b/>
+          <w:bCs/>
+          <w:color w:val="auto"/>
+          <w:sz w:val="24"/>
+          <w:szCs w:val="24"/>
+          <w:lang w:val="en-IN"/>
+        </w:rPr>
+      </w:pPr>
+      <w:bookmarkStart w:id="12" w:name="_Toc225973965"/>
+      <w:r>
+        <w:rPr>
+          <w:rFonts w:ascii="Arial" w:hAnsi="Arial" w:cs="Arial"/>
+          <w:color w:val="auto"/>
+          <w:sz w:val="24"/>
+          <w:szCs w:val="24"/>
+        </w:rPr>
+        <w:t xml:space="preserve">Figure </w:t>
+      </w:r>
+      <w:r>
+        <w:rPr>
+          <w:rFonts w:ascii="Arial" w:hAnsi="Arial" w:cs="Arial"/>
+          <w:color w:val="auto"/>
+          <w:sz w:val="24"/>
+          <w:szCs w:val="24"/>
+        </w:rPr>
+        <w:fldChar w:fldCharType="begin"/>
+      </w:r>
+      <w:r>
+        <w:rPr>
+          <w:rFonts w:ascii="Arial" w:hAnsi="Arial" w:cs="Arial"/>
+          <w:color w:val="auto"/>
+          <w:sz w:val="24"/>
+          <w:szCs w:val="24"/>
+        </w:rPr>
+        <w:instrText xml:space="preserve"> SEQ Figure \* ARABIC </w:instrText>
+      </w:r>
+      <w:r>
+        <w:rPr>
+          <w:rFonts w:ascii="Arial" w:hAnsi="Arial" w:cs="Arial"/>
+          <w:color w:val="auto"/>
+          <w:sz w:val="24"/>
+          <w:szCs w:val="24"/>
+        </w:rPr>
+        <w:fldChar w:fldCharType="separate"/>
+      </w:r>
+      <w:r>
+        <w:rPr>
+          <w:rFonts w:ascii="Arial" w:hAnsi="Arial" w:cs="Arial"/>
+          <w:noProof/>
+          <w:color w:val="auto"/>
+          <w:sz w:val="24"/>
+          <w:szCs w:val="24"/>
+        </w:rPr>
+        <w:t>5</w:t>
+      </w:r>
+      <w:r>
+        <w:rPr>
+          <w:rFonts w:ascii="Arial" w:hAnsi="Arial" w:cs="Arial"/>
+          <w:color w:val="auto"/>
+          <w:sz w:val="24"/>
+          <w:szCs w:val="24"/>
+        </w:rPr>
+        <w:fldChar w:fldCharType="end"/>
+      </w:r>
+      <w:r>
+        <w:rPr>
+          <w:rFonts w:ascii="Arial" w:hAnsi="Arial" w:cs="Arial"/>
+          <w:color w:val="auto"/>
+          <w:sz w:val="24"/>
+          <w:szCs w:val="24"/>
+        </w:rPr>
+        <w:t xml:space="preserve">: </w:t>
+      </w:r>
+      <w:r>
+        <w:rPr>
+          <w:rFonts w:ascii="Arial" w:hAnsi="Arial" w:cs="Arial"/>
+          <w:color w:val="auto"/>
+          <w:sz w:val="24"/>
+          <w:szCs w:val="24"/>
+        </w:rPr>
+        <w:t xml:space="preserve">User </w:t>
+      </w:r>
+      <w:r>
+        <w:rPr>
+          <w:rFonts w:ascii="Arial" w:hAnsi="Arial" w:cs="Arial"/>
+          <w:color w:val="auto"/>
+          <w:sz w:val="24"/>
+          <w:szCs w:val="24"/>
+        </w:rPr>
+        <w:t>Registration Page</w:t>
+      </w:r>
+      <w:bookmarkEnd w:id="12"/>
+    </w:p>
+    <w:p>
+      <w:pPr>
         <w:spacing w:after="160" w:line="360" w:lineRule="auto"/>
         <w:ind w:left="720"/>
         <w:jc w:val="both"/>
@@ -15528,7 +17189,7 @@
           <w:bCs/>
           <w:lang w:val="en-IN"/>
         </w:rPr>
-        <w:t>User Login Page</w:t>
+        <w:t>Login Page</w:t>
       </w:r>
       <w:r>
         <w:rPr>
@@ -15607,6 +17268,85 @@
     </w:p>
     <w:p>
       <w:pPr>
+        <w:pStyle w:val="Caption"/>
+        <w:jc w:val="center"/>
+        <w:rPr>
+          <w:rFonts w:ascii="Arial" w:hAnsi="Arial" w:cs="Arial"/>
+          <w:color w:val="auto"/>
+          <w:sz w:val="24"/>
+          <w:szCs w:val="24"/>
+          <w:lang w:val="en-IN"/>
+        </w:rPr>
+      </w:pPr>
+      <w:bookmarkStart w:id="13" w:name="_Toc225973966"/>
+      <w:r>
+        <w:rPr>
+          <w:rFonts w:ascii="Arial" w:hAnsi="Arial" w:cs="Arial"/>
+          <w:color w:val="auto"/>
+          <w:sz w:val="24"/>
+          <w:szCs w:val="24"/>
+        </w:rPr>
+        <w:t xml:space="preserve">Figure </w:t>
+      </w:r>
+      <w:r>
+        <w:rPr>
+          <w:rFonts w:ascii="Arial" w:hAnsi="Arial" w:cs="Arial"/>
+          <w:color w:val="auto"/>
+          <w:sz w:val="24"/>
+          <w:szCs w:val="24"/>
+        </w:rPr>
+        <w:fldChar w:fldCharType="begin"/>
+      </w:r>
+      <w:r>
+        <w:rPr>
+          <w:rFonts w:ascii="Arial" w:hAnsi="Arial" w:cs="Arial"/>
+          <w:color w:val="auto"/>
+          <w:sz w:val="24"/>
+          <w:szCs w:val="24"/>
+        </w:rPr>
+        <w:instrText xml:space="preserve"> SEQ Figure \* ARABIC </w:instrText>
+      </w:r>
+      <w:r>
+        <w:rPr>
+          <w:rFonts w:ascii="Arial" w:hAnsi="Arial" w:cs="Arial"/>
+          <w:color w:val="auto"/>
+          <w:sz w:val="24"/>
+          <w:szCs w:val="24"/>
+        </w:rPr>
+        <w:fldChar w:fldCharType="separate"/>
+      </w:r>
+      <w:r>
+        <w:rPr>
+          <w:rFonts w:ascii="Arial" w:hAnsi="Arial" w:cs="Arial"/>
+          <w:noProof/>
+          <w:color w:val="auto"/>
+          <w:sz w:val="24"/>
+          <w:szCs w:val="24"/>
+        </w:rPr>
+        <w:t>6</w:t>
+      </w:r>
+      <w:r>
+        <w:rPr>
+          <w:rFonts w:ascii="Arial" w:hAnsi="Arial" w:cs="Arial"/>
+          <w:color w:val="auto"/>
+          <w:sz w:val="24"/>
+          <w:szCs w:val="24"/>
+        </w:rPr>
+        <w:fldChar w:fldCharType="end"/>
+      </w:r>
+      <w:r>
+        <w:rPr>
+          <w:rFonts w:ascii="Arial" w:hAnsi="Arial" w:cs="Arial"/>
+          <w:color w:val="auto"/>
+          <w:sz w:val="24"/>
+          <w:szCs w:val="24"/>
+        </w:rPr>
+        <w:t>: Login Page</w:t>
+      </w:r>
+      <w:bookmarkEnd w:id="13"/>
+    </w:p>
+    <w:p>
+      <w:pPr>
         <w:numPr>
           <w:ilvl w:val="0"/>
           <w:numId w:val="20"/>
@@ -15625,6 +17365,7 @@
           <w:bCs/>
           <w:lang w:val="en-IN"/>
         </w:rPr>
+        <w:lastRenderedPageBreak/>
         <w:t>Patient Dashboard</w:t>
       </w:r>
       <w:r>
@@ -15652,7 +17393,6 @@
           <w:noProof/>
           <w:lang w:val="en-IN"/>
         </w:rPr>
-        <w:lastRenderedPageBreak/>
         <w:drawing>
           <wp:inline distT="0" distB="0" distL="0" distR="0" wp14:anchorId="65615D5F" wp14:editId="5CA10EA1">
             <wp:extent cx="5720080" cy="3221355"/>
@@ -15705,14 +17445,82 @@
     </w:p>
     <w:p>
       <w:pPr>
-        <w:spacing w:after="160" w:line="360" w:lineRule="auto"/>
-        <w:ind w:left="720"/>
-        <w:jc w:val="both"/>
-        <w:rPr>
-          <w:rFonts w:ascii="Arial" w:hAnsi="Arial" w:cs="Arial"/>
-          <w:lang w:val="en-IN"/>
-        </w:rPr>
-      </w:pPr>
+        <w:pStyle w:val="Caption"/>
+        <w:jc w:val="center"/>
+        <w:rPr>
+          <w:rFonts w:ascii="Arial" w:hAnsi="Arial" w:cs="Arial"/>
+          <w:color w:val="auto"/>
+          <w:sz w:val="24"/>
+          <w:szCs w:val="24"/>
+          <w:lang w:val="en-IN"/>
+        </w:rPr>
+      </w:pPr>
+      <w:bookmarkStart w:id="14" w:name="_Toc225973967"/>
+      <w:r>
+        <w:rPr>
+          <w:rFonts w:ascii="Arial" w:hAnsi="Arial" w:cs="Arial"/>
+          <w:color w:val="auto"/>
+          <w:sz w:val="24"/>
+          <w:szCs w:val="24"/>
+        </w:rPr>
+        <w:t xml:space="preserve">Figure </w:t>
+      </w:r>
+      <w:r>
+        <w:rPr>
+          <w:rFonts w:ascii="Arial" w:hAnsi="Arial" w:cs="Arial"/>
+          <w:color w:val="auto"/>
+          <w:sz w:val="24"/>
+          <w:szCs w:val="24"/>
+        </w:rPr>
+        <w:fldChar w:fldCharType="begin"/>
+      </w:r>
+      <w:r>
+        <w:rPr>
+          <w:rFonts w:ascii="Arial" w:hAnsi="Arial" w:cs="Arial"/>
+          <w:color w:val="auto"/>
+          <w:sz w:val="24"/>
+          <w:szCs w:val="24"/>
+        </w:rPr>
+        <w:instrText xml:space="preserve"> SEQ Figure \* ARABIC </w:instrText>
+      </w:r>
+      <w:r>
+        <w:rPr>
+          <w:rFonts w:ascii="Arial" w:hAnsi="Arial" w:cs="Arial"/>
+          <w:color w:val="auto"/>
+          <w:sz w:val="24"/>
+          <w:szCs w:val="24"/>
+        </w:rPr>
+        <w:fldChar w:fldCharType="separate"/>
+      </w:r>
+      <w:r>
+        <w:rPr>
+          <w:rFonts w:ascii="Arial" w:hAnsi="Arial" w:cs="Arial"/>
+          <w:noProof/>
+          <w:color w:val="auto"/>
+          <w:sz w:val="24"/>
+          <w:szCs w:val="24"/>
+        </w:rPr>
+        <w:t>7</w:t>
+      </w:r>
+      <w:r>
+        <w:rPr>
+          <w:rFonts w:ascii="Arial" w:hAnsi="Arial" w:cs="Arial"/>
+          <w:color w:val="auto"/>
+          <w:sz w:val="24"/>
+          <w:szCs w:val="24"/>
+        </w:rPr>
+        <w:fldChar w:fldCharType="end"/>
+      </w:r>
+      <w:r>
+        <w:rPr>
+          <w:rFonts w:ascii="Arial" w:hAnsi="Arial" w:cs="Arial"/>
+          <w:color w:val="auto"/>
+          <w:sz w:val="24"/>
+          <w:szCs w:val="24"/>
+        </w:rPr>
+        <w:t>: Patient Dashboard</w:t>
+      </w:r>
+      <w:bookmarkEnd w:id="14"/>
     </w:p>
     <w:p>
       <w:pPr>
@@ -15811,6 +17619,85 @@
     </w:p>
     <w:p>
       <w:pPr>
+        <w:pStyle w:val="Caption"/>
+        <w:jc w:val="center"/>
+        <w:rPr>
+          <w:rFonts w:ascii="Arial" w:hAnsi="Arial" w:cs="Arial"/>
+          <w:color w:val="auto"/>
+          <w:sz w:val="24"/>
+          <w:szCs w:val="24"/>
+          <w:lang w:val="en-IN"/>
+        </w:rPr>
+      </w:pPr>
+      <w:bookmarkStart w:id="15" w:name="_Toc225973968"/>
+      <w:r>
+        <w:rPr>
+          <w:rFonts w:ascii="Arial" w:hAnsi="Arial" w:cs="Arial"/>
+          <w:color w:val="auto"/>
+          <w:sz w:val="24"/>
+          <w:szCs w:val="24"/>
+        </w:rPr>
+        <w:t xml:space="preserve">Figure </w:t>
+      </w:r>
+      <w:r>
+        <w:rPr>
+          <w:rFonts w:ascii="Arial" w:hAnsi="Arial" w:cs="Arial"/>
+          <w:color w:val="auto"/>
+          <w:sz w:val="24"/>
+          <w:szCs w:val="24"/>
+        </w:rPr>
+        <w:fldChar w:fldCharType="begin"/>
+      </w:r>
+      <w:r>
+        <w:rPr>
+          <w:rFonts w:ascii="Arial" w:hAnsi="Arial" w:cs="Arial"/>
+          <w:color w:val="auto"/>
+          <w:sz w:val="24"/>
+          <w:szCs w:val="24"/>
+        </w:rPr>
+        <w:instrText xml:space="preserve"> SEQ Figure \* ARABIC </w:instrText>
+      </w:r>
+      <w:r>
+        <w:rPr>
+          <w:rFonts w:ascii="Arial" w:hAnsi="Arial" w:cs="Arial"/>
+          <w:color w:val="auto"/>
+          <w:sz w:val="24"/>
+          <w:szCs w:val="24"/>
+        </w:rPr>
+        <w:fldChar w:fldCharType="separate"/>
+      </w:r>
+      <w:r>
+        <w:rPr>
+          <w:rFonts w:ascii="Arial" w:hAnsi="Arial" w:cs="Arial"/>
+          <w:noProof/>
+          <w:color w:val="auto"/>
+          <w:sz w:val="24"/>
+          <w:szCs w:val="24"/>
+        </w:rPr>
+        <w:t>8</w:t>
+      </w:r>
+      <w:r>
+        <w:rPr>
+          <w:rFonts w:ascii="Arial" w:hAnsi="Arial" w:cs="Arial"/>
+          <w:color w:val="auto"/>
+          <w:sz w:val="24"/>
+          <w:szCs w:val="24"/>
+        </w:rPr>
+        <w:fldChar w:fldCharType="end"/>
+      </w:r>
+      <w:r>
+        <w:rPr>
+          <w:rFonts w:ascii="Arial" w:hAnsi="Arial" w:cs="Arial"/>
+          <w:color w:val="auto"/>
+          <w:sz w:val="24"/>
+          <w:szCs w:val="24"/>
+        </w:rPr>
+        <w:t>: Doctor Appointment Page</w:t>
+      </w:r>
+      <w:bookmarkEnd w:id="15"/>
+    </w:p>
+    <w:p>
+      <w:pPr>
         <w:spacing w:after="160" w:line="360" w:lineRule="auto"/>
         <w:ind w:left="720"/>
         <w:jc w:val="both"/>
@@ -15840,6 +17727,7 @@
           <w:bCs/>
           <w:lang w:val="en-IN"/>
         </w:rPr>
+        <w:lastRenderedPageBreak/>
         <w:t>Buy Medicines Page</w:t>
       </w:r>
       <w:r>
@@ -15865,9 +17753,8 @@
           <w:noProof/>
           <w:lang w:val="en-IN"/>
         </w:rPr>
-        <w:lastRenderedPageBreak/>
         <w:drawing>
-          <wp:inline distT="0" distB="0" distL="0" distR="0" wp14:anchorId="3721DD44" wp14:editId="656DBE6C">
+          <wp:inline distT="0" distB="0" distL="0" distR="0" wp14:anchorId="3721DD44" wp14:editId="0FCB0E39">
             <wp:extent cx="5720080" cy="3221355"/>
             <wp:effectExtent l="0" t="0" r="0" b="0"/>
             <wp:docPr id="737715345" name="Picture 11"/>
@@ -15915,6 +17802,85 @@
           </wp:inline>
         </w:drawing>
       </w:r>
+    </w:p>
+    <w:p>
+      <w:pPr>
+        <w:pStyle w:val="Caption"/>
+        <w:jc w:val="center"/>
+        <w:rPr>
+          <w:rFonts w:ascii="Arial" w:hAnsi="Arial" w:cs="Arial"/>
+          <w:color w:val="auto"/>
+          <w:sz w:val="24"/>
+          <w:szCs w:val="24"/>
+          <w:lang w:val="en-IN"/>
+        </w:rPr>
+      </w:pPr>
+      <w:bookmarkStart w:id="16" w:name="_Toc225973969"/>
+      <w:r>
+        <w:rPr>
+          <w:rFonts w:ascii="Arial" w:hAnsi="Arial" w:cs="Arial"/>
+          <w:color w:val="auto"/>
+          <w:sz w:val="24"/>
+          <w:szCs w:val="24"/>
+        </w:rPr>
+        <w:t xml:space="preserve">Figure </w:t>
+      </w:r>
+      <w:r>
+        <w:rPr>
+          <w:rFonts w:ascii="Arial" w:hAnsi="Arial" w:cs="Arial"/>
+          <w:color w:val="auto"/>
+          <w:sz w:val="24"/>
+          <w:szCs w:val="24"/>
+        </w:rPr>
+        <w:fldChar w:fldCharType="begin"/>
+      </w:r>
+      <w:r>
+        <w:rPr>
+          <w:rFonts w:ascii="Arial" w:hAnsi="Arial" w:cs="Arial"/>
+          <w:color w:val="auto"/>
+          <w:sz w:val="24"/>
+          <w:szCs w:val="24"/>
+        </w:rPr>
+        <w:instrText xml:space="preserve"> SEQ Figure \* ARABIC </w:instrText>
+      </w:r>
+      <w:r>
+        <w:rPr>
+          <w:rFonts w:ascii="Arial" w:hAnsi="Arial" w:cs="Arial"/>
+          <w:color w:val="auto"/>
+          <w:sz w:val="24"/>
+          <w:szCs w:val="24"/>
+        </w:rPr>
+        <w:fldChar w:fldCharType="separate"/>
+      </w:r>
+      <w:r>
+        <w:rPr>
+          <w:rFonts w:ascii="Arial" w:hAnsi="Arial" w:cs="Arial"/>
+          <w:noProof/>
+          <w:color w:val="auto"/>
+          <w:sz w:val="24"/>
+          <w:szCs w:val="24"/>
+        </w:rPr>
+        <w:t>9</w:t>
+      </w:r>
+      <w:r>
+        <w:rPr>
+          <w:rFonts w:ascii="Arial" w:hAnsi="Arial" w:cs="Arial"/>
+          <w:color w:val="auto"/>
+          <w:sz w:val="24"/>
+          <w:szCs w:val="24"/>
+        </w:rPr>
+        <w:fldChar w:fldCharType="end"/>
+      </w:r>
+      <w:r>
+        <w:rPr>
+          <w:rFonts w:ascii="Arial" w:hAnsi="Arial" w:cs="Arial"/>
+          <w:color w:val="auto"/>
+          <w:sz w:val="24"/>
+          <w:szCs w:val="24"/>
+        </w:rPr>
+        <w:t>: Buy Medicines Page</w:t>
+      </w:r>
+      <w:bookmarkEnd w:id="16"/>
     </w:p>
     <w:p>
       <w:pPr>
@@ -16028,6 +17994,79 @@
     </w:p>
     <w:p>
       <w:pPr>
+        <w:pStyle w:val="Caption"/>
+        <w:jc w:val="center"/>
+        <w:rPr>
+          <w:rFonts w:ascii="Arial" w:hAnsi="Arial" w:cs="Arial"/>
+          <w:b/>
+          <w:bCs/>
+          <w:sz w:val="24"/>
+          <w:szCs w:val="24"/>
+          <w:lang w:val="en-IN"/>
+        </w:rPr>
+      </w:pPr>
+      <w:bookmarkStart w:id="17" w:name="_Toc225973970"/>
+      <w:r>
+        <w:rPr>
+          <w:rFonts w:ascii="Arial" w:hAnsi="Arial" w:cs="Arial"/>
+          <w:sz w:val="24"/>
+          <w:szCs w:val="24"/>
+        </w:rPr>
+        <w:t xml:space="preserve">Figure </w:t>
+      </w:r>
+      <w:r>
+        <w:rPr>
+          <w:rFonts w:ascii="Arial" w:hAnsi="Arial" w:cs="Arial"/>
+          <w:sz w:val="24"/>
+          <w:szCs w:val="24"/>
+        </w:rPr>
+        <w:fldChar w:fldCharType="begin"/>
+      </w:r>
+      <w:r>
+        <w:rPr>
+          <w:rFonts w:ascii="Arial" w:hAnsi="Arial" w:cs="Arial"/>
+          <w:sz w:val="24"/>
+          <w:szCs w:val="24"/>
+        </w:rPr>
+        <w:instrText xml:space="preserve"> SEQ Figure \* ARABIC </w:instrText>
+      </w:r>
+      <w:r>
+        <w:rPr>
+          <w:rFonts w:ascii="Arial" w:hAnsi="Arial" w:cs="Arial"/>
+          <w:sz w:val="24"/>
+          <w:szCs w:val="24"/>
+        </w:rPr>
+        <w:fldChar w:fldCharType="separate"/>
+      </w:r>
+      <w:r>
+        <w:rPr>
+          <w:rFonts w:ascii="Arial" w:hAnsi="Arial" w:cs="Arial"/>
+          <w:noProof/>
+          <w:sz w:val="24"/>
+          <w:szCs w:val="24"/>
+        </w:rPr>
+        <w:t>10</w:t>
+      </w:r>
+      <w:r>
+        <w:rPr>
+          <w:rFonts w:ascii="Arial" w:hAnsi="Arial" w:cs="Arial"/>
+          <w:sz w:val="24"/>
+          <w:szCs w:val="24"/>
+        </w:rPr>
+        <w:fldChar w:fldCharType="end"/>
+      </w:r>
+      <w:r>
+        <w:rPr>
+          <w:rFonts w:ascii="Arial" w:hAnsi="Arial" w:cs="Arial"/>
+          <w:sz w:val="24"/>
+          <w:szCs w:val="24"/>
+        </w:rPr>
+        <w:t>: Health Records Page</w:t>
+      </w:r>
+      <w:bookmarkEnd w:id="17"/>
+    </w:p>
+    <w:p>
+      <w:pPr>
         <w:spacing w:after="160" w:line="360" w:lineRule="auto"/>
         <w:ind w:left="720"/>
         <w:jc w:val="both"/>
@@ -16057,6 +18096,7 @@
           <w:bCs/>
           <w:lang w:val="en-IN"/>
         </w:rPr>
+        <w:lastRenderedPageBreak/>
         <w:t>AI Health Assistant Interface</w:t>
       </w:r>
       <w:r>
@@ -16084,7 +18124,6 @@
           <w:noProof/>
           <w:lang w:val="en-IN"/>
         </w:rPr>
-        <w:lastRenderedPageBreak/>
         <w:drawing>
           <wp:inline distT="0" distB="0" distL="0" distR="0" wp14:anchorId="140EFF94" wp14:editId="7119234C">
             <wp:extent cx="5720080" cy="3221355"/>
@@ -16137,6 +18176,85 @@
     </w:p>
     <w:p>
       <w:pPr>
+        <w:pStyle w:val="Caption"/>
+        <w:jc w:val="center"/>
+        <w:rPr>
+          <w:rFonts w:ascii="Arial" w:hAnsi="Arial" w:cs="Arial"/>
+          <w:color w:val="auto"/>
+          <w:sz w:val="24"/>
+          <w:szCs w:val="24"/>
+          <w:lang w:val="en-IN"/>
+        </w:rPr>
+      </w:pPr>
+      <w:bookmarkStart w:id="18" w:name="_Toc225973971"/>
+      <w:r>
+        <w:rPr>
+          <w:rFonts w:ascii="Arial" w:hAnsi="Arial" w:cs="Arial"/>
+          <w:color w:val="auto"/>
+          <w:sz w:val="24"/>
+          <w:szCs w:val="24"/>
+        </w:rPr>
+        <w:t xml:space="preserve">Figure </w:t>
+      </w:r>
+      <w:r>
+        <w:rPr>
+          <w:rFonts w:ascii="Arial" w:hAnsi="Arial" w:cs="Arial"/>
+          <w:color w:val="auto"/>
+          <w:sz w:val="24"/>
+          <w:szCs w:val="24"/>
+        </w:rPr>
+        <w:fldChar w:fldCharType="begin"/>
+      </w:r>
+      <w:r>
+        <w:rPr>
+          <w:rFonts w:ascii="Arial" w:hAnsi="Arial" w:cs="Arial"/>
+          <w:color w:val="auto"/>
+          <w:sz w:val="24"/>
+          <w:szCs w:val="24"/>
+        </w:rPr>
+        <w:instrText xml:space="preserve"> SEQ Figure \* ARABIC </w:instrText>
+      </w:r>
+      <w:r>
+        <w:rPr>
+          <w:rFonts w:ascii="Arial" w:hAnsi="Arial" w:cs="Arial"/>
+          <w:color w:val="auto"/>
+          <w:sz w:val="24"/>
+          <w:szCs w:val="24"/>
+        </w:rPr>
+        <w:fldChar w:fldCharType="separate"/>
+      </w:r>
+      <w:r>
+        <w:rPr>
+          <w:rFonts w:ascii="Arial" w:hAnsi="Arial" w:cs="Arial"/>
+          <w:noProof/>
+          <w:color w:val="auto"/>
+          <w:sz w:val="24"/>
+          <w:szCs w:val="24"/>
+        </w:rPr>
+        <w:t>11</w:t>
+      </w:r>
+      <w:r>
+        <w:rPr>
+          <w:rFonts w:ascii="Arial" w:hAnsi="Arial" w:cs="Arial"/>
+          <w:color w:val="auto"/>
+          <w:sz w:val="24"/>
+          <w:szCs w:val="24"/>
+        </w:rPr>
+        <w:fldChar w:fldCharType="end"/>
+      </w:r>
+      <w:r>
+        <w:rPr>
+          <w:rFonts w:ascii="Arial" w:hAnsi="Arial" w:cs="Arial"/>
+          <w:color w:val="auto"/>
+          <w:sz w:val="24"/>
+          <w:szCs w:val="24"/>
+        </w:rPr>
+        <w:t>: AI Health Assistant Interface</w:t>
+      </w:r>
+      <w:bookmarkEnd w:id="18"/>
+    </w:p>
+    <w:p>
+      <w:pPr>
         <w:spacing w:after="160" w:line="360" w:lineRule="auto"/>
         <w:ind w:left="720"/>
         <w:jc w:val="both"/>
@@ -16245,46 +18363,82 @@
     </w:p>
     <w:p>
       <w:pPr>
-        <w:pStyle w:val="2H"/>
-        <w:jc w:val="both"/>
-      </w:pPr>
-    </w:p>
-    <w:p>
-      <w:pPr>
-        <w:pStyle w:val="H2"/>
-        <w:jc w:val="both"/>
-      </w:pPr>
-    </w:p>
-    <w:p>
-      <w:pPr>
-        <w:pStyle w:val="H2"/>
-        <w:jc w:val="both"/>
-      </w:pPr>
-    </w:p>
-    <w:p>
-      <w:pPr>
-        <w:pStyle w:val="H2"/>
-        <w:jc w:val="both"/>
-      </w:pPr>
-    </w:p>
-    <w:p>
-      <w:pPr>
-        <w:spacing w:after="160" w:line="360" w:lineRule="auto"/>
-        <w:jc w:val="both"/>
-        <w:rPr>
-          <w:rFonts w:ascii="Arial" w:hAnsi="Arial" w:cs="Arial"/>
-          <w:b/>
-          <w:bCs/>
-          <w:caps/>
-          <w:szCs w:val="28"/>
-        </w:rPr>
-      </w:pPr>
-      <w:r>
-        <w:rPr>
-          <w:rFonts w:ascii="Arial" w:hAnsi="Arial" w:cs="Arial"/>
-        </w:rPr>
-        <w:br w:type="page"/>
-      </w:r>
+        <w:pStyle w:val="Caption"/>
+        <w:jc w:val="center"/>
+        <w:rPr>
+          <w:rFonts w:ascii="Arial" w:hAnsi="Arial" w:cs="Arial"/>
+          <w:color w:val="auto"/>
+          <w:sz w:val="24"/>
+          <w:szCs w:val="24"/>
+          <w:lang w:val="en-IN"/>
+        </w:rPr>
+      </w:pPr>
+      <w:bookmarkStart w:id="19" w:name="_Toc225973972"/>
+      <w:r>
+        <w:rPr>
+          <w:rFonts w:ascii="Arial" w:hAnsi="Arial" w:cs="Arial"/>
+          <w:color w:val="auto"/>
+          <w:sz w:val="24"/>
+          <w:szCs w:val="24"/>
+        </w:rPr>
+        <w:t xml:space="preserve">Figure </w:t>
+      </w:r>
+      <w:r>
+        <w:rPr>
+          <w:rFonts w:ascii="Arial" w:hAnsi="Arial" w:cs="Arial"/>
+          <w:color w:val="auto"/>
+          <w:sz w:val="24"/>
+          <w:szCs w:val="24"/>
+        </w:rPr>
+        <w:fldChar w:fldCharType="begin"/>
+      </w:r>
+      <w:r>
+        <w:rPr>
+          <w:rFonts w:ascii="Arial" w:hAnsi="Arial" w:cs="Arial"/>
+          <w:color w:val="auto"/>
+          <w:sz w:val="24"/>
+          <w:szCs w:val="24"/>
+        </w:rPr>
+        <w:instrText xml:space="preserve"> SEQ Figure \* ARABIC </w:instrText>
+      </w:r>
+      <w:r>
+        <w:rPr>
+          <w:rFonts w:ascii="Arial" w:hAnsi="Arial" w:cs="Arial"/>
+          <w:color w:val="auto"/>
+          <w:sz w:val="24"/>
+          <w:szCs w:val="24"/>
+        </w:rPr>
+        <w:fldChar w:fldCharType="separate"/>
+      </w:r>
+      <w:r>
+        <w:rPr>
+          <w:rFonts w:ascii="Arial" w:hAnsi="Arial" w:cs="Arial"/>
+          <w:noProof/>
+          <w:color w:val="auto"/>
+          <w:sz w:val="24"/>
+          <w:szCs w:val="24"/>
+        </w:rPr>
+        <w:t>12</w:t>
+      </w:r>
+      <w:r>
+        <w:rPr>
+          <w:rFonts w:ascii="Arial" w:hAnsi="Arial" w:cs="Arial"/>
+          <w:color w:val="auto"/>
+          <w:sz w:val="24"/>
+          <w:szCs w:val="24"/>
+        </w:rPr>
+        <w:fldChar w:fldCharType="end"/>
+      </w:r>
+      <w:r>
+        <w:rPr>
+          <w:rFonts w:ascii="Arial" w:hAnsi="Arial" w:cs="Arial"/>
+          <w:color w:val="auto"/>
+          <w:sz w:val="24"/>
+          <w:szCs w:val="24"/>
+        </w:rPr>
+        <w:t>: Emergency Assistance Page</w:t>
+      </w:r>
+      <w:bookmarkEnd w:id="19"/>
     </w:p>
     <w:p>
       <w:pPr>
@@ -20993,7 +23147,7 @@
   <w:style w:type="paragraph" w:default="1" w:styleId="Normal">
     <w:name w:val="Normal"/>
     <w:qFormat/>
-    <w:rsid w:val="00E70CC8"/>
+    <w:rsid w:val="00A22214"/>
     <w:pPr>
       <w:spacing w:after="0" w:line="240" w:lineRule="auto"/>
     </w:pPr>
@@ -21204,6 +23358,7 @@
   <w:style w:type="character" w:default="1" w:styleId="DefaultParagraphFont">
     <w:name w:val="Default Paragraph Font"/>
     <w:uiPriority w:val="1"/>
+    <w:semiHidden/>
     <w:unhideWhenUsed/>
   </w:style>
   <w:style w:type="table" w:default="1" w:styleId="TableNormal">

</xml_diff>